<commit_message>
streamlit app with pdf report added
</commit_message>
<xml_diff>
--- a/SURVIVE_v1-1_Software_Note.docx
+++ b/SURVIVE_v1-1_Software_Note.docx
@@ -5,15 +5,23 @@
     <w:p>
       <w:pPr>
         <w:pStyle w:val="Rubrik"/>
+        <w:jc w:val="left"/>
       </w:pPr>
       <w:bookmarkStart w:id="0" w:name="survive-v1.1-software-note"/>
       <w:r>
-        <w:t>SURVIVE v1.1 — Software Note</w:t>
+        <w:rPr>
+          <w:smallCaps/>
+        </w:rPr>
+        <w:t>Survive</w:t>
+      </w:r>
+      <w:r>
+        <w:t xml:space="preserve"> v1.1 — Software Note</w:t>
       </w:r>
     </w:p>
     <w:p>
       <w:pPr>
         <w:pStyle w:val="Underrubrik"/>
+        <w:jc w:val="left"/>
       </w:pPr>
       <w:bookmarkStart w:id="1" w:name="X95128532f9addaf5b1342270eeebfb46ef0d137"/>
       <w:r>
@@ -22,52 +30,85 @@
     </w:p>
     <w:p>
       <w:pPr>
+        <w:pStyle w:val="Brdtext"/>
+        <w:sectPr>
+          <w:footerReference w:type="default" r:id="rId8"/>
+          <w:footerReference w:type="first" r:id="rId9"/>
+          <w:footnotePr>
+            <w:numRestart w:val="eachSect"/>
+          </w:footnotePr>
+          <w:type w:val="continuous"/>
+          <w:pgSz w:w="12240" w:h="15840"/>
+          <w:pgMar w:top="1417" w:right="1417" w:bottom="1417" w:left="1417" w:header="720" w:footer="720" w:gutter="0"/>
+          <w:cols w:space="518"/>
+          <w:titlePg/>
+          <w:docGrid w:linePitch="326"/>
+        </w:sectPr>
+      </w:pPr>
+    </w:p>
+    <w:p>
+      <w:pPr>
         <w:pStyle w:val="FirstParagraph"/>
-        <w:jc w:val="center"/>
-      </w:pPr>
-      <w:r>
-        <w:rPr>
-          <w:i/>
-          <w:iCs/>
-        </w:rPr>
-        <w:t>Eric Wahlsteen | 2026</w:t>
-      </w:r>
-    </w:p>
-    <w:p>
-      <w:pPr>
-        <w:pStyle w:val="Rubrik1"/>
-      </w:pPr>
+        <w:jc w:val="left"/>
+      </w:pPr>
+      <w:r>
+        <w:t>Eric Wahlstee</w:t>
+      </w:r>
+      <w:r>
+        <w:t>n</w:t>
+      </w:r>
       <w:bookmarkStart w:id="2" w:name="introduction"/>
       <w:bookmarkEnd w:id="1"/>
       <w:r>
+        <w:rPr>
+          <w:vertAlign w:val="superscript"/>
+        </w:rPr>
+        <w:t>1</w:t>
+      </w:r>
+    </w:p>
+    <w:p>
+      <w:pPr>
+        <w:pStyle w:val="Rubrik1"/>
+        <w:jc w:val="left"/>
+      </w:pPr>
+    </w:p>
+    <w:p>
+      <w:pPr>
+        <w:pStyle w:val="Brdtext"/>
+        <w:sectPr>
+          <w:footnotePr>
+            <w:numRestart w:val="eachSect"/>
+          </w:footnotePr>
+          <w:type w:val="continuous"/>
+          <w:pgSz w:w="12240" w:h="15840"/>
+          <w:pgMar w:top="1417" w:right="1417" w:bottom="1417" w:left="1417" w:header="720" w:footer="720" w:gutter="0"/>
+          <w:cols w:space="720"/>
+        </w:sectPr>
+      </w:pPr>
+    </w:p>
+    <w:p>
+      <w:pPr>
+        <w:pStyle w:val="Rubrik1"/>
+        <w:jc w:val="left"/>
+      </w:pPr>
+      <w:r>
         <w:t>Introduction</w:t>
       </w:r>
     </w:p>
     <w:p>
       <w:pPr>
-        <w:pStyle w:val="FirstParagraph"/>
-      </w:pPr>
-      <w:r>
-        <w:t>SURVIVE v1.1 is a Python-based population viability analysis (PVA</w:t>
-      </w:r>
-      <w:proofErr w:type="gramStart"/>
-      <w:r>
-        <w:t>) tool</w:t>
-      </w:r>
-      <w:proofErr w:type="gramEnd"/>
-      <w:r>
-        <w:t xml:space="preserve"> designed to assess the long-term viability of small or threatened populations under uncertainty. It integrates demographic and genetic sub-models within a unified framework, enabling practitioners to evaluate the relative importance of stochastic demography, genetic drift, immigration, and density dependence on population persistence over a user-defined time horizon (default 100 years).</w:t>
-      </w:r>
-    </w:p>
-    <w:p>
-      <w:pPr>
         <w:pStyle w:val="Brdtext"/>
       </w:pPr>
       <w:r>
-        <w:t>The tool is designed for ecological consulting workflows in which species-specific parameters are stored in separate configuration files</w:t>
-      </w:r>
-      <w:r>
-        <w:t>, allowing rapid scenario switching without modifying the core model code. It currently supports the following life-history archetypes: monocarpic perennials (e.g. </w:t>
+        <w:t>SURVIVE v1.1 is a Python-based population viability analysis (PVA) tool designed to assess the long-term viability of small or threatened populations under uncertainty. It integrates demographic and genetic sub-models within a unified framework, enabling practitioners to evaluate the relative importance of stochastic demography, genetic drift, immigration, and density dependence on population persistence over a user-defined time horizon (default 100 years).</w:t>
+      </w:r>
+    </w:p>
+    <w:p>
+      <w:pPr>
+        <w:pStyle w:val="Brdtext"/>
+      </w:pPr>
+      <w:r>
+        <w:t>The tool is designed for ecological consulting workflows in which species-specific parameters are stored in separate configuration files, allowing rapid scenario switching without modifying the core model code. It currently supports the following life-history archetypes: monocarpic perennials (e.g. </w:t>
       </w:r>
       <w:r>
         <w:rPr>
@@ -151,7 +192,13 @@
         <w:pStyle w:val="Brdtext"/>
       </w:pPr>
       <w:r>
-        <w:t xml:space="preserve">SURVIVE v1.1 produces an Excel results table and a suite of standardised figures for each run. Run parameters are automatically logged to </w:t>
+        <w:rPr>
+          <w:smallCaps/>
+        </w:rPr>
+        <w:t>Survive</w:t>
+      </w:r>
+      <w:r>
+        <w:t xml:space="preserve"> v1.1 produces an Excel results table and a suite of standardised figures for each run. Run parameters are automatically logged to </w:t>
       </w:r>
       <w:r>
         <w:rPr>
@@ -169,10 +216,7 @@
       </w:pPr>
       <w:bookmarkStart w:id="3" w:name="design-philosophy"/>
       <w:r>
-        <w:t xml:space="preserve">Design </w:t>
-      </w:r>
-      <w:r>
-        <w:t>Philosophy</w:t>
+        <w:t>Design Philosophy</w:t>
       </w:r>
     </w:p>
     <w:p>
@@ -189,15 +233,10 @@
         <w:t>link</w:t>
       </w:r>
       <w:r>
-        <w:t xml:space="preserve">, C), each </w:t>
-      </w:r>
-      <w:proofErr w:type="spellStart"/>
-      <w:r>
-        <w:t>emphasising</w:t>
-      </w:r>
-      <w:proofErr w:type="spellEnd"/>
-      <w:r>
-        <w:t xml:space="preserve"> a different ecological mechanism. Their outputs </w:t>
+        <w:t>, C), each emphasising a different ecological mechanism. Their out</w:t>
+      </w:r>
+      <w:r>
+        <w:t xml:space="preserve">puts </w:t>
       </w:r>
       <w:r>
         <w:t>can be</w:t>
@@ -205,19 +244,16 @@
       <w:r>
         <w:t xml:space="preserve"> combined in a configurable meta-model. This structure makes model assumptions explicit and facilitates communication with non-specialist stakeholders: each sub-model can be presented and defended independently.</w:t>
       </w:r>
-    </w:p>
-    <w:p>
-      <w:pPr>
-        <w:pStyle w:val="Rubrik1"/>
-      </w:pPr>
       <w:bookmarkStart w:id="4" w:name="theoretical-framework"/>
       <w:bookmarkEnd w:id="2"/>
       <w:bookmarkEnd w:id="3"/>
-      <w:r>
-        <w:t>Theoretical</w:t>
-      </w:r>
-      <w:r>
-        <w:t xml:space="preserve"> Framework</w:t>
+    </w:p>
+    <w:p>
+      <w:pPr>
+        <w:pStyle w:val="Rubrik1"/>
+      </w:pPr>
+      <w:r>
+        <w:t>Theoretical Framework</w:t>
       </w:r>
     </w:p>
     <w:p>
@@ -226,19 +262,23 @@
       </w:pPr>
       <w:bookmarkStart w:id="5" w:name="population-viability-analysis"/>
       <w:r>
-        <w:t>Population</w:t>
-      </w:r>
-      <w:r>
-        <w:t xml:space="preserve"> Viability Analysis</w:t>
-      </w:r>
-    </w:p>
-    <w:p>
-      <w:pPr>
-        <w:pStyle w:val="FirstParagraph"/>
-      </w:pPr>
-      <w:r>
-        <w:lastRenderedPageBreak/>
-        <w:t xml:space="preserve">PVA is the formal process of estimating the probability that a population will persist for a specified period (Dennis et al. 1991; Beissinger &amp; Westphal 1998). </w:t>
+        <w:t>Population Viability Analysis</w:t>
+      </w:r>
+    </w:p>
+    <w:p>
+      <w:pPr>
+        <w:pStyle w:val="Brdtext"/>
+      </w:pPr>
+      <w:r>
+        <w:t xml:space="preserve">PVA is the formal process of estimating the probability that a population will persist for a specified period (Dennis et al. 1991; </w:t>
+      </w:r>
+      <w:proofErr w:type="spellStart"/>
+      <w:r>
+        <w:t>Beissinger</w:t>
+      </w:r>
+      <w:proofErr w:type="spellEnd"/>
+      <w:r>
+        <w:t xml:space="preserve"> &amp; Westphal 1998). </w:t>
       </w:r>
       <w:r>
         <w:rPr>
@@ -258,10 +298,7 @@
         </m:r>
       </m:oMath>
       <w:r>
-        <w:t xml:space="preserve"> </w:t>
-      </w:r>
-      <w:r>
-        <w:t xml:space="preserve">falls to or below a quasi-extinction threshold </w:t>
+        <w:t xml:space="preserve"> falls to or below a quasi-extinction threshold </w:t>
       </w:r>
       <m:oMath>
         <m:r>
@@ -319,12 +356,16 @@
             </m:rPr>
             <w:rPr>
               <w:rFonts w:ascii="Cambria Math" w:hAnsi="Cambria Math"/>
+              <w:sz w:val="20"/>
+              <w:szCs w:val="22"/>
             </w:rPr>
             <m:t>ln</m:t>
           </m:r>
           <m:r>
             <w:rPr>
               <w:rFonts w:ascii="Cambria Math" w:hAnsi="Cambria Math"/>
+              <w:sz w:val="20"/>
+              <w:szCs w:val="22"/>
             </w:rPr>
             <m:t>N</m:t>
           </m:r>
@@ -333,6 +374,8 @@
               <m:ctrlPr>
                 <w:rPr>
                   <w:rFonts w:ascii="Cambria Math" w:hAnsi="Cambria Math"/>
+                  <w:sz w:val="20"/>
+                  <w:szCs w:val="22"/>
                 </w:rPr>
               </m:ctrlPr>
             </m:dPr>
@@ -340,6 +383,8 @@
               <m:r>
                 <w:rPr>
                   <w:rFonts w:ascii="Cambria Math" w:hAnsi="Cambria Math"/>
+                  <w:sz w:val="20"/>
+                  <w:szCs w:val="22"/>
                 </w:rPr>
                 <m:t>t</m:t>
               </m:r>
@@ -349,12 +394,16 @@
                 </m:rPr>
                 <w:rPr>
                   <w:rFonts w:ascii="Cambria Math" w:hAnsi="Cambria Math"/>
+                  <w:sz w:val="20"/>
+                  <w:szCs w:val="22"/>
                 </w:rPr>
                 <m:t>+</m:t>
               </m:r>
               <m:r>
                 <w:rPr>
                   <w:rFonts w:ascii="Cambria Math" w:hAnsi="Cambria Math"/>
+                  <w:sz w:val="20"/>
+                  <w:szCs w:val="22"/>
                 </w:rPr>
                 <m:t>1</m:t>
               </m:r>
@@ -366,12 +415,16 @@
             </m:rPr>
             <w:rPr>
               <w:rFonts w:ascii="Cambria Math" w:hAnsi="Cambria Math"/>
+              <w:sz w:val="20"/>
+              <w:szCs w:val="22"/>
             </w:rPr>
             <m:t>=ln</m:t>
           </m:r>
           <m:r>
             <w:rPr>
               <w:rFonts w:ascii="Cambria Math" w:hAnsi="Cambria Math"/>
+              <w:sz w:val="20"/>
+              <w:szCs w:val="22"/>
             </w:rPr>
             <m:t>N</m:t>
           </m:r>
@@ -380,6 +433,8 @@
               <m:ctrlPr>
                 <w:rPr>
                   <w:rFonts w:ascii="Cambria Math" w:hAnsi="Cambria Math"/>
+                  <w:sz w:val="20"/>
+                  <w:szCs w:val="22"/>
                 </w:rPr>
               </m:ctrlPr>
             </m:dPr>
@@ -387,6 +442,8 @@
               <m:r>
                 <w:rPr>
                   <w:rFonts w:ascii="Cambria Math" w:hAnsi="Cambria Math"/>
+                  <w:sz w:val="20"/>
+                  <w:szCs w:val="22"/>
                 </w:rPr>
                 <m:t>t</m:t>
               </m:r>
@@ -398,12 +455,16 @@
             </m:rPr>
             <w:rPr>
               <w:rFonts w:ascii="Cambria Math" w:hAnsi="Cambria Math"/>
+              <w:sz w:val="20"/>
+              <w:szCs w:val="22"/>
             </w:rPr>
             <m:t>+</m:t>
           </m:r>
           <m:r>
             <w:rPr>
               <w:rFonts w:ascii="Cambria Math" w:hAnsi="Cambria Math"/>
+              <w:sz w:val="20"/>
+              <w:szCs w:val="22"/>
             </w:rPr>
             <m:t>μ</m:t>
           </m:r>
@@ -412,6 +473,8 @@
               <m:ctrlPr>
                 <w:rPr>
                   <w:rFonts w:ascii="Cambria Math" w:hAnsi="Cambria Math"/>
+                  <w:sz w:val="20"/>
+                  <w:szCs w:val="22"/>
                 </w:rPr>
               </m:ctrlPr>
             </m:dPr>
@@ -419,6 +482,8 @@
               <m:r>
                 <w:rPr>
                   <w:rFonts w:ascii="Cambria Math" w:hAnsi="Cambria Math"/>
+                  <w:sz w:val="20"/>
+                  <w:szCs w:val="22"/>
                 </w:rPr>
                 <m:t>t</m:t>
               </m:r>
@@ -430,6 +495,8 @@
             </m:rPr>
             <w:rPr>
               <w:rFonts w:ascii="Cambria Math" w:hAnsi="Cambria Math"/>
+              <w:sz w:val="20"/>
+              <w:szCs w:val="22"/>
             </w:rPr>
             <m:t>+</m:t>
           </m:r>
@@ -438,6 +505,8 @@
               <m:ctrlPr>
                 <w:rPr>
                   <w:rFonts w:ascii="Cambria Math" w:hAnsi="Cambria Math"/>
+                  <w:sz w:val="20"/>
+                  <w:szCs w:val="22"/>
                 </w:rPr>
               </m:ctrlPr>
             </m:sSubPr>
@@ -445,6 +514,8 @@
               <m:r>
                 <w:rPr>
                   <w:rFonts w:ascii="Cambria Math" w:hAnsi="Cambria Math"/>
+                  <w:sz w:val="20"/>
+                  <w:szCs w:val="22"/>
                 </w:rPr>
                 <m:t>σ</m:t>
               </m:r>
@@ -454,6 +525,10 @@
                 <m:rPr>
                   <m:nor/>
                 </m:rPr>
+                <w:rPr>
+                  <w:sz w:val="20"/>
+                  <w:szCs w:val="22"/>
+                </w:rPr>
                 <m:t>eff</m:t>
               </m:r>
             </m:sub>
@@ -463,6 +538,8 @@
               <m:ctrlPr>
                 <w:rPr>
                   <w:rFonts w:ascii="Cambria Math" w:hAnsi="Cambria Math"/>
+                  <w:sz w:val="20"/>
+                  <w:szCs w:val="22"/>
                 </w:rPr>
               </m:ctrlPr>
             </m:dPr>
@@ -470,6 +547,8 @@
               <m:r>
                 <w:rPr>
                   <w:rFonts w:ascii="Cambria Math" w:hAnsi="Cambria Math"/>
+                  <w:sz w:val="20"/>
+                  <w:szCs w:val="22"/>
                 </w:rPr>
                 <m:t>t</m:t>
               </m:r>
@@ -481,12 +560,16 @@
             </m:rPr>
             <w:rPr>
               <w:rFonts w:ascii="Cambria Math" w:hAnsi="Cambria Math"/>
+              <w:sz w:val="20"/>
+              <w:szCs w:val="22"/>
             </w:rPr>
             <m:t>⋅</m:t>
           </m:r>
           <m:r>
             <w:rPr>
               <w:rFonts w:ascii="Cambria Math" w:hAnsi="Cambria Math"/>
+              <w:sz w:val="20"/>
+              <w:szCs w:val="22"/>
             </w:rPr>
             <m:t>Z</m:t>
           </m:r>
@@ -495,6 +578,8 @@
               <m:ctrlPr>
                 <w:rPr>
                   <w:rFonts w:ascii="Cambria Math" w:hAnsi="Cambria Math"/>
+                  <w:sz w:val="20"/>
+                  <w:szCs w:val="22"/>
                 </w:rPr>
               </m:ctrlPr>
             </m:dPr>
@@ -502,6 +587,8 @@
               <m:r>
                 <w:rPr>
                   <w:rFonts w:ascii="Cambria Math" w:hAnsi="Cambria Math"/>
+                  <w:sz w:val="20"/>
+                  <w:szCs w:val="22"/>
                 </w:rPr>
                 <m:t>t</m:t>
               </m:r>
@@ -513,12 +600,16 @@
             </m:rPr>
             <w:rPr>
               <w:rFonts w:ascii="Cambria Math" w:hAnsi="Cambria Math"/>
+              <w:sz w:val="20"/>
+              <w:szCs w:val="22"/>
             </w:rPr>
             <m:t>+ln</m:t>
           </m:r>
           <m:r>
             <w:rPr>
               <w:rFonts w:ascii="Cambria Math" w:hAnsi="Cambria Math"/>
+              <w:sz w:val="20"/>
+              <w:szCs w:val="22"/>
             </w:rPr>
             <m:t>​</m:t>
           </m:r>
@@ -527,6 +618,8 @@
               <m:ctrlPr>
                 <w:rPr>
                   <w:rFonts w:ascii="Cambria Math" w:hAnsi="Cambria Math"/>
+                  <w:sz w:val="20"/>
+                  <w:szCs w:val="22"/>
                 </w:rPr>
               </m:ctrlPr>
             </m:dPr>
@@ -534,6 +627,8 @@
               <m:r>
                 <w:rPr>
                   <w:rFonts w:ascii="Cambria Math" w:hAnsi="Cambria Math"/>
+                  <w:sz w:val="20"/>
+                  <w:szCs w:val="22"/>
                 </w:rPr>
                 <m:t>1</m:t>
               </m:r>
@@ -543,12 +638,16 @@
                 </m:rPr>
                 <w:rPr>
                   <w:rFonts w:ascii="Cambria Math" w:hAnsi="Cambria Math"/>
+                  <w:sz w:val="20"/>
+                  <w:szCs w:val="22"/>
                 </w:rPr>
                 <m:t>+</m:t>
               </m:r>
               <m:r>
                 <w:rPr>
                   <w:rFonts w:ascii="Cambria Math" w:hAnsi="Cambria Math"/>
+                  <w:sz w:val="20"/>
+                  <w:szCs w:val="22"/>
                 </w:rPr>
                 <m:t>I</m:t>
               </m:r>
@@ -558,12 +657,16 @@
                 </m:rPr>
                 <w:rPr>
                   <w:rFonts w:ascii="Cambria Math" w:hAnsi="Cambria Math"/>
+                  <w:sz w:val="20"/>
+                  <w:szCs w:val="22"/>
                 </w:rPr>
                 <m:t>/</m:t>
               </m:r>
               <m:r>
                 <w:rPr>
                   <w:rFonts w:ascii="Cambria Math" w:hAnsi="Cambria Math"/>
+                  <w:sz w:val="20"/>
+                  <w:szCs w:val="22"/>
                 </w:rPr>
                 <m:t>N</m:t>
               </m:r>
@@ -573,12 +676,16 @@
                 </m:rPr>
                 <w:rPr>
                   <w:rFonts w:ascii="Cambria Math" w:hAnsi="Cambria Math"/>
+                  <w:sz w:val="20"/>
+                  <w:szCs w:val="22"/>
                 </w:rPr>
                 <m:t>(</m:t>
               </m:r>
               <m:r>
                 <w:rPr>
                   <w:rFonts w:ascii="Cambria Math" w:hAnsi="Cambria Math"/>
+                  <w:sz w:val="20"/>
+                  <w:szCs w:val="22"/>
                 </w:rPr>
                 <m:t>t</m:t>
               </m:r>
@@ -588,6 +695,8 @@
                 </m:rPr>
                 <w:rPr>
                   <w:rFonts w:ascii="Cambria Math" w:hAnsi="Cambria Math"/>
+                  <w:sz w:val="20"/>
+                  <w:szCs w:val="22"/>
                 </w:rPr>
                 <m:t>)</m:t>
               </m:r>
@@ -678,9 +787,20 @@
     </w:p>
     <w:p>
       <w:pPr>
+        <w:rPr>
+          <w:sz w:val="22"/>
+        </w:rPr>
+      </w:pPr>
+      <w:r>
+        <w:br w:type="page"/>
+      </w:r>
+    </w:p>
+    <w:p>
+      <w:pPr>
         <w:pStyle w:val="Brdtext"/>
       </w:pPr>
       <w:r>
+        <w:lastRenderedPageBreak/>
         <w:t>Ricker:</w:t>
       </w:r>
     </w:p>
@@ -1083,10 +1203,7 @@
         </m:r>
       </m:oMath>
       <w:r>
-        <w:t xml:space="preserve"> </w:t>
-      </w:r>
-      <w:r>
-        <w:t xml:space="preserve">term is the Itô correction ensuring that the expected value of the multiplicative process matches </w:t>
+        <w:t xml:space="preserve"> term is the Itô correction ensuring that the expected value of the multiplicative process matches </w:t>
       </w:r>
       <m:oMath>
         <m:r>
@@ -1103,6 +1220,7 @@
     <w:p>
       <w:pPr>
         <w:pStyle w:val="Indragetstycke"/>
+        <w:ind w:right="-52"/>
       </w:pPr>
       <w:r>
         <w:rPr>
@@ -1112,10 +1230,7 @@
         <w:t>Practical note:</w:t>
       </w:r>
       <w:r>
-        <w:t xml:space="preserve"> </w:t>
-      </w:r>
-      <w:r>
-        <w:t xml:space="preserve">At </w:t>
+        <w:t xml:space="preserve"> At </w:t>
       </w:r>
       <m:oMath>
         <m:r>
@@ -1213,136 +1328,60 @@
     </w:p>
     <w:p>
       <w:pPr>
-        <w:pStyle w:val="SourceCode"/>
+        <w:pStyle w:val="Brdtext"/>
       </w:pPr>
       <m:oMathPara>
         <m:oMath>
           <m:r>
             <w:rPr>
-              <w:rStyle w:val="VerbatimChar"/>
               <w:rFonts w:ascii="Cambria Math" w:hAnsi="Cambria Math"/>
             </w:rPr>
-            <m:t>N</m:t>
-          </m:r>
-          <m:d>
-            <m:dPr>
-              <m:ctrlPr>
-                <w:rPr>
-                  <w:rStyle w:val="VerbatimChar"/>
-                  <w:rFonts w:ascii="Cambria Math" w:hAnsi="Cambria Math"/>
-                  <w:i/>
-                </w:rPr>
-              </m:ctrlPr>
-            </m:dPr>
-            <m:e>
-              <m:r>
-                <w:rPr>
-                  <w:rStyle w:val="VerbatimChar"/>
-                  <w:rFonts w:ascii="Cambria Math" w:hAnsi="Cambria Math"/>
-                </w:rPr>
-                <m:t>t+1</m:t>
-              </m:r>
-            </m:e>
-          </m:d>
-          <m:r>
-            <w:rPr>
-              <w:rStyle w:val="VerbatimChar"/>
-              <w:rFonts w:ascii="Cambria Math" w:hAnsi="Cambria Math"/>
-            </w:rPr>
-            <m:t>← N</m:t>
-          </m:r>
-          <m:d>
-            <m:dPr>
-              <m:ctrlPr>
-                <w:rPr>
-                  <w:rStyle w:val="VerbatimChar"/>
-                  <w:rFonts w:ascii="Cambria Math" w:hAnsi="Cambria Math"/>
-                  <w:i/>
-                </w:rPr>
-              </m:ctrlPr>
-            </m:dPr>
-            <m:e>
-              <m:r>
-                <w:rPr>
-                  <w:rStyle w:val="VerbatimChar"/>
-                  <w:rFonts w:ascii="Cambria Math" w:hAnsi="Cambria Math"/>
-                </w:rPr>
-                <m:t>t+1</m:t>
-              </m:r>
-            </m:e>
-          </m:d>
-          <m:r>
-            <w:rPr>
-              <w:rStyle w:val="VerbatimChar"/>
-              <w:rFonts w:ascii="Cambria Math" w:hAnsi="Cambria Math"/>
-            </w:rPr>
-            <m:t xml:space="preserve">· </m:t>
-          </m:r>
-          <m:d>
-            <m:dPr>
-              <m:ctrlPr>
-                <w:rPr>
-                  <w:rStyle w:val="VerbatimChar"/>
-                  <w:rFonts w:ascii="Cambria Math" w:hAnsi="Cambria Math"/>
-                  <w:i/>
-                </w:rPr>
-              </m:ctrlPr>
-            </m:dPr>
-            <m:e>
-              <m:r>
-                <w:rPr>
-                  <w:rStyle w:val="VerbatimChar"/>
-                  <w:rFonts w:ascii="Cambria Math" w:hAnsi="Cambria Math"/>
-                </w:rPr>
-                <m:t>1 - severity</m:t>
-              </m:r>
-            </m:e>
-          </m:d>
-          <m:r>
-            <w:rPr>
-              <w:rStyle w:val="VerbatimChar"/>
-              <w:rFonts w:ascii="Cambria Math" w:hAnsi="Cambria Math"/>
-            </w:rPr>
-            <m:t xml:space="preserve">  with probability </m:t>
-          </m:r>
-          <m:sSub>
-            <m:sSubPr>
-              <m:ctrlPr>
-                <w:rPr>
-                  <w:rStyle w:val="VerbatimChar"/>
-                  <w:rFonts w:ascii="Cambria Math" w:hAnsi="Cambria Math"/>
-                  <w:i/>
-                </w:rPr>
-              </m:ctrlPr>
-            </m:sSubPr>
-            <m:e>
-              <m:r>
-                <w:rPr>
-                  <w:rStyle w:val="VerbatimChar"/>
-                  <w:rFonts w:ascii="Cambria Math" w:hAnsi="Cambria Math"/>
-                </w:rPr>
-                <m:t>p</m:t>
-              </m:r>
-            </m:e>
-            <m:sub>
-              <m:r>
-                <w:rPr>
-                  <w:rStyle w:val="VerbatimChar"/>
-                  <w:rFonts w:ascii="Cambria Math" w:hAnsi="Cambria Math"/>
-                </w:rPr>
-                <m:t>event</m:t>
-              </m:r>
-            </m:sub>
-          </m:sSub>
-          <m:r>
-            <w:rPr>
-              <w:rStyle w:val="VerbatimChar"/>
-              <w:rFonts w:ascii="Cambria Math" w:hAnsi="Cambria Math"/>
-            </w:rPr>
-            <m:t>per replicate per year</m:t>
+            <m:t xml:space="preserve">N(t+1)← N(t+1)· (1 - severity)   </m:t>
           </m:r>
         </m:oMath>
       </m:oMathPara>
+    </w:p>
+    <w:p>
+      <w:pPr>
+        <w:pStyle w:val="Brdtext"/>
+      </w:pPr>
+      <w:r>
+        <w:t xml:space="preserve">with probability </w:t>
+      </w:r>
+      <m:oMath>
+        <m:sSub>
+          <m:sSubPr>
+            <m:ctrlPr>
+              <w:rPr>
+                <w:rFonts w:ascii="Cambria Math" w:hAnsi="Cambria Math"/>
+                <w:i/>
+              </w:rPr>
+            </m:ctrlPr>
+          </m:sSubPr>
+          <m:e>
+            <m:r>
+              <w:rPr>
+                <w:rFonts w:ascii="Cambria Math" w:hAnsi="Cambria Math"/>
+              </w:rPr>
+              <m:t>p</m:t>
+            </m:r>
+          </m:e>
+          <m:sub>
+            <m:r>
+              <w:rPr>
+                <w:rFonts w:ascii="Cambria Math" w:hAnsi="Cambria Math"/>
+              </w:rPr>
+              <m:t>event</m:t>
+            </m:r>
+          </m:sub>
+        </m:sSub>
+      </m:oMath>
+      <w:r>
+        <w:t xml:space="preserve"> </w:t>
+      </w:r>
+      <w:r>
+        <w:t>per replicate per year</w:t>
+      </w:r>
     </w:p>
     <w:p>
       <w:pPr>
@@ -1407,7 +1446,6 @@
       <w:bookmarkStart w:id="7" w:name="X149b4b32747c6f1fc1396583b9571410ac5764c"/>
       <w:bookmarkEnd w:id="6"/>
       <w:r>
-        <w:lastRenderedPageBreak/>
         <w:t>Analytical Quasi-extinction Probability</w:t>
       </w:r>
     </w:p>
@@ -1433,9 +1471,17 @@
             <m:t>P_ext = Φ(z₁) + (Q/N₀)^(2μ/σ²) · Φ(z₂)</m:t>
           </m:r>
           <m:r>
+            <m:rPr>
+              <m:sty m:val="p"/>
+            </m:rPr>
             <w:br/>
           </m:r>
+        </m:oMath>
+        <m:oMath>
           <m:r>
+            <m:rPr>
+              <m:sty m:val="p"/>
+            </m:rPr>
             <w:br/>
           </m:r>
         </m:oMath>
@@ -1448,6 +1494,9 @@
             <m:t>z₁ = (ln(Q/N₀) - μ·T) / (σ√T)</m:t>
           </m:r>
           <m:r>
+            <m:rPr>
+              <m:sty m:val="p"/>
+            </m:rPr>
             <w:br/>
           </m:r>
         </m:oMath>
@@ -1467,7 +1516,10 @@
         <w:pStyle w:val="FirstParagraph"/>
       </w:pPr>
       <w:r>
-        <w:t>where Φ is the standard normal CDF. This two-term formulation accounts for the full first-passage probability, not just the terminal-time probability (Dennis et al. 1991), and is used for scenario scoring and sensitivity analysis.</w:t>
+        <w:t xml:space="preserve">where Φ is the standard normal CDF. This two-term formulation accounts for the full first-passage probability, not just the terminal-time probability (Dennis et al. 1991), and </w:t>
+      </w:r>
+      <w:r>
+        <w:t>is used for scenario scoring and sensitivity analysis.</w:t>
       </w:r>
     </w:p>
     <w:p>
@@ -1484,13 +1536,8 @@
       <w:pPr>
         <w:pStyle w:val="FirstParagraph"/>
       </w:pPr>
-      <w:proofErr w:type="gramStart"/>
-      <w:r>
-        <w:t>The effective</w:t>
-      </w:r>
-      <w:proofErr w:type="gramEnd"/>
-      <w:r>
-        <w:t xml:space="preserve"> population size </w:t>
+      <w:r>
+        <w:t xml:space="preserve">The effective population size </w:t>
       </w:r>
       <m:oMath>
         <m:sSub>
@@ -1521,10 +1568,7 @@
         </m:sSub>
       </m:oMath>
       <w:r>
-        <w:t xml:space="preserve"> </w:t>
-      </w:r>
-      <w:r>
-        <w:t xml:space="preserve">governs the rate of genetic drift and inbreeding. </w:t>
+        <w:t xml:space="preserve"> governs the rate of genetic drift and inbreeding. </w:t>
       </w:r>
       <w:r>
         <w:rPr>
@@ -1557,10 +1601,7 @@
       </w:r>
       <w:proofErr w:type="spellEnd"/>
       <w:r>
-        <w:t xml:space="preserve"> </w:t>
-      </w:r>
-      <w:r>
-        <w:t xml:space="preserve">= ratio × </w:t>
+        <w:t xml:space="preserve"> = ratio × </w:t>
       </w:r>
       <w:r>
         <w:rPr>
@@ -1591,10 +1632,7 @@
         <w:t>gen</w:t>
       </w:r>
       <w:r>
-        <w:t xml:space="preserve"> </w:t>
-      </w:r>
-      <w:r>
-        <w:t xml:space="preserve">= ratio × </w:t>
+        <w:t xml:space="preserve"> = ratio × </w:t>
       </w:r>
       <w:r>
         <w:rPr>
@@ -1671,10 +1709,16 @@
     <w:p>
       <w:pPr>
         <w:pStyle w:val="Rubrik4"/>
+        <w:rPr>
+          <w:color w:val="auto"/>
+        </w:rPr>
       </w:pPr>
       <w:bookmarkStart w:id="10" w:name="Xa75ea445d568e7f14439b84e61e4f754d4c1166"/>
       <w:r>
-        <w:t>2.5.1 Monocarpic Perennials — Vitalis et al. (2004)</w:t>
+        <w:rPr>
+          <w:color w:val="auto"/>
+        </w:rPr>
+        <w:t>Monocarpic Perennials — Vitalis et al. (2004)</w:t>
       </w:r>
     </w:p>
     <w:p>
@@ -1833,7 +1877,15 @@
         <w:pStyle w:val="FirstParagraph"/>
       </w:pPr>
       <w:r>
-        <w:t>where N is the annual census of flowering adults, T is generation time in years, and s is the fraction of established rosettes that die before ever flowering (pre-reproductive mortality). The multiplier relative to the annual Ne baseline (ratio × N) is:</w:t>
+        <w:t xml:space="preserve">where N is the annual census of flowering adults, T is generation time in years, and </w:t>
+      </w:r>
+      <w:proofErr w:type="spellStart"/>
+      <w:r>
+        <w:t>s</w:t>
+      </w:r>
+      <w:proofErr w:type="spellEnd"/>
+      <w:r>
+        <w:t xml:space="preserve"> is the fraction of established rosettes that die before ever flowering (pre-reproductive mortality). The multiplier relative to the annual Ne baseline (ratio × N) is:</w:t>
       </w:r>
     </w:p>
     <w:p>
@@ -1847,7 +1899,6 @@
               <w:rStyle w:val="VerbatimChar"/>
               <w:rFonts w:ascii="Cambria Math" w:hAnsi="Cambria Math"/>
             </w:rPr>
-            <w:lastRenderedPageBreak/>
             <m:t xml:space="preserve">multiplier = </m:t>
           </m:r>
           <m:d>
@@ -1920,6 +1971,7 @@
         <w:pStyle w:val="FirstParagraph"/>
       </w:pPr>
       <w:r>
+        <w:lastRenderedPageBreak/>
         <w:t xml:space="preserve">For </w:t>
       </w:r>
       <w:r>
@@ -1927,24 +1979,25 @@
           <w:i/>
           <w:iCs/>
         </w:rPr>
-        <w:t>Verbascum lychnitis</w:t>
-      </w:r>
-      <w:r>
-        <w:t xml:space="preserve"> (T = 4, s = 0.05): </w:t>
-      </w:r>
-      <w:r>
-        <w:t>multiplier ≈ 3.9×</w:t>
-      </w:r>
-      <w:r>
-        <w:t>.</w:t>
-      </w:r>
-      <w:r>
-        <w:t xml:space="preserve"> This means an annual Ne/Nc of 0.10 corresponds to a generational Ne/Nc of ~0.39, substantially reducing drift per generation.</w:t>
+        <w:t xml:space="preserve">Verbascum </w:t>
+      </w:r>
+      <w:proofErr w:type="spellStart"/>
+      <w:r>
+        <w:rPr>
+          <w:i/>
+          <w:iCs/>
+        </w:rPr>
+        <w:t>lychnitis</w:t>
+      </w:r>
+      <w:proofErr w:type="spellEnd"/>
+      <w:r>
+        <w:t xml:space="preserve"> (T = 4, s = 0.05): multiplier ≈ 3.9×. This means an annual Ne/Nc of 0.10 corresponds to a generational Ne/Nc of ~0.39, substantially reducing drift per generation.</w:t>
       </w:r>
     </w:p>
     <w:p>
       <w:pPr>
         <w:pStyle w:val="Indragetstycke"/>
+        <w:ind w:right="-52"/>
       </w:pPr>
       <w:r>
         <w:rPr>
@@ -2021,11 +2074,17 @@
     <w:p>
       <w:pPr>
         <w:pStyle w:val="Rubrik4"/>
+        <w:rPr>
+          <w:color w:val="auto"/>
+        </w:rPr>
       </w:pPr>
       <w:bookmarkStart w:id="11" w:name="annuals-with-seed-bank-nunney-2002"/>
       <w:bookmarkEnd w:id="10"/>
       <w:r>
-        <w:t>2.5.2 Annuals with Seed Bank — Nunney (2002)</w:t>
+        <w:rPr>
+          <w:color w:val="auto"/>
+        </w:rPr>
+        <w:t>Annuals with Seed Bank — Nunney (2002)</w:t>
       </w:r>
     </w:p>
     <w:p>
@@ -2091,11 +2150,17 @@
     <w:p>
       <w:pPr>
         <w:pStyle w:val="Rubrik4"/>
+        <w:rPr>
+          <w:color w:val="auto"/>
+        </w:rPr>
       </w:pPr>
       <w:bookmarkStart w:id="12" w:name="iteroparous-organisms-nunney-1991"/>
       <w:bookmarkEnd w:id="11"/>
       <w:r>
-        <w:t>2.5.3 Iteroparous Organisms — Nunney (1991)</w:t>
+        <w:rPr>
+          <w:color w:val="auto"/>
+        </w:rPr>
+        <w:t>Iteroparous Organisms — Nunney (1991)</w:t>
       </w:r>
     </w:p>
     <w:p>
@@ -2402,7 +2467,15 @@
         <w:pStyle w:val="FirstParagraph"/>
       </w:pPr>
       <w:r>
-        <w:t>With immigration (Wright island model), inbreeding recurses across generations:</w:t>
+        <w:t>With immigration (</w:t>
+      </w:r>
+      <w:proofErr w:type="gramStart"/>
+      <w:r>
+        <w:t>Wright island</w:t>
+      </w:r>
+      <w:proofErr w:type="gramEnd"/>
+      <w:r>
+        <w:t xml:space="preserve"> model), inbreeding recurses across generations:</w:t>
       </w:r>
     </w:p>
     <w:p>
@@ -2418,6 +2491,8 @@
                   <w:rStyle w:val="VerbatimChar"/>
                   <w:rFonts w:ascii="Cambria Math" w:hAnsi="Cambria Math"/>
                   <w:i/>
+                  <w:sz w:val="20"/>
+                  <w:szCs w:val="22"/>
                 </w:rPr>
               </m:ctrlPr>
             </m:sSubPr>
@@ -2426,6 +2501,8 @@
                 <w:rPr>
                   <w:rStyle w:val="VerbatimChar"/>
                   <w:rFonts w:ascii="Cambria Math" w:hAnsi="Cambria Math"/>
+                  <w:sz w:val="20"/>
+                  <w:szCs w:val="22"/>
                 </w:rPr>
                 <m:t>F</m:t>
               </m:r>
@@ -2440,6 +2517,8 @@
                       <w:rStyle w:val="VerbatimChar"/>
                       <w:rFonts w:ascii="Cambria Math" w:hAnsi="Cambria Math"/>
                       <w:i/>
+                      <w:sz w:val="20"/>
+                      <w:szCs w:val="22"/>
                     </w:rPr>
                   </m:ctrlPr>
                 </m:dPr>
@@ -2448,6 +2527,8 @@
                     <w:rPr>
                       <w:rStyle w:val="VerbatimChar"/>
                       <w:rFonts w:ascii="Cambria Math" w:hAnsi="Cambria Math"/>
+                      <w:sz w:val="20"/>
+                      <w:szCs w:val="22"/>
                     </w:rPr>
                     <m:t>g+1</m:t>
                   </m:r>
@@ -2459,6 +2540,8 @@
             <w:rPr>
               <w:rStyle w:val="VerbatimChar"/>
               <w:rFonts w:ascii="Cambria Math" w:hAnsi="Cambria Math"/>
+              <w:sz w:val="20"/>
+              <w:szCs w:val="22"/>
             </w:rPr>
             <m:t xml:space="preserve">= </m:t>
           </m:r>
@@ -2469,6 +2552,8 @@
                   <w:rStyle w:val="VerbatimChar"/>
                   <w:rFonts w:ascii="Cambria Math" w:hAnsi="Cambria Math"/>
                   <w:i/>
+                  <w:sz w:val="20"/>
+                  <w:szCs w:val="22"/>
                 </w:rPr>
               </m:ctrlPr>
             </m:sSupPr>
@@ -2480,6 +2565,8 @@
                       <w:rStyle w:val="VerbatimChar"/>
                       <w:rFonts w:ascii="Cambria Math" w:hAnsi="Cambria Math"/>
                       <w:i/>
+                      <w:sz w:val="20"/>
+                      <w:szCs w:val="22"/>
                     </w:rPr>
                   </m:ctrlPr>
                 </m:dPr>
@@ -2488,6 +2575,8 @@
                     <w:rPr>
                       <w:rStyle w:val="VerbatimChar"/>
                       <w:rFonts w:ascii="Cambria Math" w:hAnsi="Cambria Math"/>
+                      <w:sz w:val="20"/>
+                      <w:szCs w:val="22"/>
                     </w:rPr>
                     <m:t>1 - m</m:t>
                   </m:r>
@@ -2499,6 +2588,8 @@
                 <w:rPr>
                   <w:rStyle w:val="VerbatimChar"/>
                   <w:rFonts w:ascii="Cambria Math" w:hAnsi="Cambria Math"/>
+                  <w:sz w:val="20"/>
+                  <w:szCs w:val="22"/>
                 </w:rPr>
                 <m:t>2</m:t>
               </m:r>
@@ -2508,6 +2599,8 @@
             <w:rPr>
               <w:rStyle w:val="VerbatimChar"/>
               <w:rFonts w:ascii="Cambria Math" w:hAnsi="Cambria Math"/>
+              <w:sz w:val="20"/>
+              <w:szCs w:val="22"/>
             </w:rPr>
             <m:t xml:space="preserve">· </m:t>
           </m:r>
@@ -2518,6 +2611,8 @@
                   <w:rStyle w:val="VerbatimChar"/>
                   <w:rFonts w:ascii="Cambria Math" w:hAnsi="Cambria Math"/>
                   <w:i/>
+                  <w:sz w:val="20"/>
+                  <w:szCs w:val="22"/>
                 </w:rPr>
               </m:ctrlPr>
             </m:sSubPr>
@@ -2526,6 +2621,8 @@
                 <w:rPr>
                   <w:rStyle w:val="VerbatimChar"/>
                   <w:rFonts w:ascii="Cambria Math" w:hAnsi="Cambria Math"/>
+                  <w:sz w:val="20"/>
+                  <w:szCs w:val="22"/>
                 </w:rPr>
                 <m:t>F</m:t>
               </m:r>
@@ -2535,6 +2632,8 @@
                 <w:rPr>
                   <w:rStyle w:val="VerbatimChar"/>
                   <w:rFonts w:ascii="Cambria Math" w:hAnsi="Cambria Math"/>
+                  <w:sz w:val="20"/>
+                  <w:szCs w:val="22"/>
                 </w:rPr>
                 <m:t>g</m:t>
               </m:r>
@@ -2544,6 +2643,8 @@
             <w:rPr>
               <w:rStyle w:val="VerbatimChar"/>
               <w:rFonts w:ascii="Cambria Math" w:hAnsi="Cambria Math"/>
+              <w:sz w:val="20"/>
+              <w:szCs w:val="22"/>
             </w:rPr>
             <m:t xml:space="preserve">+ </m:t>
           </m:r>
@@ -2554,6 +2655,8 @@
                   <w:rStyle w:val="VerbatimChar"/>
                   <w:rFonts w:ascii="Cambria Math" w:hAnsi="Cambria Math"/>
                   <w:i/>
+                  <w:sz w:val="20"/>
+                  <w:szCs w:val="22"/>
                 </w:rPr>
               </m:ctrlPr>
             </m:dPr>
@@ -2562,6 +2665,8 @@
                 <w:rPr>
                   <w:rStyle w:val="VerbatimChar"/>
                   <w:rFonts w:ascii="Cambria Math" w:hAnsi="Cambria Math"/>
+                  <w:sz w:val="20"/>
+                  <w:szCs w:val="22"/>
                 </w:rPr>
                 <m:t xml:space="preserve">1 - </m:t>
               </m:r>
@@ -2572,6 +2677,8 @@
                       <w:rStyle w:val="VerbatimChar"/>
                       <w:rFonts w:ascii="Cambria Math" w:hAnsi="Cambria Math"/>
                       <w:i/>
+                      <w:sz w:val="20"/>
+                      <w:szCs w:val="22"/>
                     </w:rPr>
                   </m:ctrlPr>
                 </m:sSupPr>
@@ -2583,6 +2690,8 @@
                           <w:rStyle w:val="VerbatimChar"/>
                           <w:rFonts w:ascii="Cambria Math" w:hAnsi="Cambria Math"/>
                           <w:i/>
+                          <w:sz w:val="20"/>
+                          <w:szCs w:val="22"/>
                         </w:rPr>
                       </m:ctrlPr>
                     </m:dPr>
@@ -2591,6 +2700,8 @@
                         <w:rPr>
                           <w:rStyle w:val="VerbatimChar"/>
                           <w:rFonts w:ascii="Cambria Math" w:hAnsi="Cambria Math"/>
+                          <w:sz w:val="20"/>
+                          <w:szCs w:val="22"/>
                         </w:rPr>
                         <m:t>1-m</m:t>
                       </m:r>
@@ -2602,6 +2713,8 @@
                     <w:rPr>
                       <w:rStyle w:val="VerbatimChar"/>
                       <w:rFonts w:ascii="Cambria Math" w:hAnsi="Cambria Math"/>
+                      <w:sz w:val="20"/>
+                      <w:szCs w:val="22"/>
                     </w:rPr>
                     <m:t>2</m:t>
                   </m:r>
@@ -2613,6 +2726,8 @@
             <w:rPr>
               <w:rStyle w:val="VerbatimChar"/>
               <w:rFonts w:ascii="Cambria Math" w:hAnsi="Cambria Math"/>
+              <w:sz w:val="20"/>
+              <w:szCs w:val="22"/>
             </w:rPr>
             <m:t>·</m:t>
           </m:r>
@@ -2623,6 +2738,8 @@
                   <w:rStyle w:val="VerbatimChar"/>
                   <w:rFonts w:ascii="Cambria Math" w:hAnsi="Cambria Math"/>
                   <w:i/>
+                  <w:sz w:val="20"/>
+                  <w:szCs w:val="22"/>
                 </w:rPr>
               </m:ctrlPr>
             </m:fPr>
@@ -2631,6 +2748,8 @@
                 <w:rPr>
                   <w:rStyle w:val="VerbatimChar"/>
                   <w:rFonts w:ascii="Cambria Math" w:hAnsi="Cambria Math"/>
+                  <w:sz w:val="20"/>
+                  <w:szCs w:val="22"/>
                 </w:rPr>
                 <m:t>1</m:t>
               </m:r>
@@ -2640,6 +2759,8 @@
                 <w:rPr>
                   <w:rStyle w:val="VerbatimChar"/>
                   <w:rFonts w:ascii="Cambria Math" w:hAnsi="Cambria Math"/>
+                  <w:sz w:val="20"/>
+                  <w:szCs w:val="22"/>
                 </w:rPr>
                 <m:t>2Ne</m:t>
               </m:r>
@@ -2653,10 +2774,7 @@
         <w:pStyle w:val="FirstParagraph"/>
       </w:pPr>
       <w:r>
-        <w:t>where</w:t>
-      </w:r>
-      <w:r>
-        <w:t xml:space="preserve"> </w:t>
+        <w:t xml:space="preserve">where </w:t>
       </w:r>
       <m:oMath>
         <m:r>
@@ -2710,28 +2828,7 @@
               <w:rStyle w:val="VerbatimChar"/>
               <w:rFonts w:ascii="Cambria Math" w:hAnsi="Cambria Math"/>
             </w:rPr>
-            <m:t>= 1</m:t>
-          </m:r>
-          <m:r>
-            <w:rPr>
-              <w:rStyle w:val="VerbatimChar"/>
-              <w:rFonts w:ascii="Cambria Math" w:hAnsi="Cambria Math"/>
-            </w:rPr>
-            <m:t xml:space="preserve"> / (</m:t>
-          </m:r>
-          <m:r>
-            <w:rPr>
-              <w:rStyle w:val="VerbatimChar"/>
-              <w:rFonts w:ascii="Cambria Math" w:hAnsi="Cambria Math"/>
-            </w:rPr>
-            <m:t>4 · Ne · m + 1</m:t>
-          </m:r>
-          <m:r>
-            <w:rPr>
-              <w:rStyle w:val="VerbatimChar"/>
-              <w:rFonts w:ascii="Cambria Math" w:hAnsi="Cambria Math"/>
-            </w:rPr>
-            <m:t>)</m:t>
+            <m:t>= 1 / (4 · Ne · m + 1)</m:t>
           </m:r>
         </m:oMath>
       </m:oMathPara>
@@ -2741,8 +2838,15 @@
         <w:pStyle w:val="FirstParagraph"/>
       </w:pPr>
       <w:r>
-        <w:lastRenderedPageBreak/>
-        <w:t>Stochastic simulation uses binomial sampling of 2Ne gametes per generation (Wright-Fisher model), with immigration modelled as allele-frequency mixing with a genetically diverse donor pool (</w:t>
+        <w:t>Stochastic simulation uses binomial sampling of 2Ne gametes per generation (Wright-Fisher model), with immigration modelled as allele-frequency mixing with a genetically diverse donor pool</w:t>
+      </w:r>
+    </w:p>
+    <w:p>
+      <w:pPr>
+        <w:pStyle w:val="FirstParagraph"/>
+      </w:pPr>
+      <w:r>
+        <w:t xml:space="preserve"> (</w:t>
       </w:r>
       <m:oMath>
         <m:r>
@@ -3123,10 +3227,7 @@
         </m:sSub>
       </m:oMath>
       <w:r>
-        <w:t xml:space="preserve"> </w:t>
-      </w:r>
-      <w:r>
-        <w:t xml:space="preserve">(unmodified), and catastrophes. Ne does </w:t>
+        <w:t xml:space="preserve"> (unmodified), and catastrophes. Ne does </w:t>
       </w:r>
       <w:r>
         <w:t>not</w:t>
@@ -3139,7 +3240,15 @@
           <w:i/>
           <w:iCs/>
         </w:rPr>
-        <w:t>would this population persist at this census size, with these growth parameters and this immigration, if genetic effects are ignored?</w:t>
+        <w:t xml:space="preserve">would this population persist at this census size, with these growth </w:t>
+      </w:r>
+      <w:r>
+        <w:rPr>
+          <w:i/>
+          <w:iCs/>
+        </w:rPr>
+        <w:lastRenderedPageBreak/>
+        <w:t>parameters and this immigration, if genetic effects are ignored?</w:t>
       </w:r>
     </w:p>
     <w:p>
@@ -3234,12 +3343,12 @@
     </w:p>
     <w:p>
       <w:pPr>
-        <w:pStyle w:val="Rubrik3"/>
+        <w:pStyle w:val="Underrubrik"/>
       </w:pPr>
       <w:bookmarkStart w:id="17" w:name="sub-model-b-genetics-only"/>
       <w:bookmarkEnd w:id="16"/>
       <w:r>
-        <w:t>3.2 Sub-model B: Genetics-only</w:t>
+        <w:t>Sub-model B: Genetics-only</w:t>
       </w:r>
     </w:p>
     <w:p>
@@ -3256,30 +3365,17 @@
       </w:pPr>
       <w:proofErr w:type="spellStart"/>
       <w:r>
+        <w:t>B</w:t>
+      </w:r>
+      <w:r>
         <w:rPr>
-          <w:b/>
-          <w:bCs/>
-        </w:rPr>
-        <w:t>B</w:t>
-      </w:r>
-      <w:r>
-        <w:rPr>
-          <w:b/>
-          <w:bCs/>
           <w:vertAlign w:val="subscript"/>
         </w:rPr>
         <w:t>const</w:t>
       </w:r>
       <w:proofErr w:type="spellEnd"/>
       <w:r>
-        <w:rPr>
-          <w:b/>
-          <w:bCs/>
-        </w:rPr>
-        <w:t xml:space="preserve"> (analytical):</w:t>
-      </w:r>
-      <w:r>
-        <w:t xml:space="preserve"> Inbreeding </w:t>
+        <w:t xml:space="preserve"> (analytical): Inbreeding </w:t>
       </w:r>
       <m:oMath>
         <m:r>
@@ -3290,10 +3386,7 @@
         </m:r>
       </m:oMath>
       <w:r>
-        <w:t xml:space="preserve"> </w:t>
-      </w:r>
-      <w:r>
-        <w:t xml:space="preserve">and heterozygosity </w:t>
+        <w:t xml:space="preserve"> and heterozygosity </w:t>
       </w:r>
       <m:oMath>
         <m:r>
@@ -3359,31 +3452,17 @@
       </w:pPr>
       <w:proofErr w:type="spellStart"/>
       <w:r>
+        <w:t>B</w:t>
+      </w:r>
+      <w:r>
         <w:rPr>
-          <w:b/>
-          <w:bCs/>
-        </w:rPr>
-        <w:lastRenderedPageBreak/>
-        <w:t>B</w:t>
-      </w:r>
-      <w:r>
-        <w:rPr>
-          <w:b/>
-          <w:bCs/>
           <w:vertAlign w:val="subscript"/>
         </w:rPr>
         <w:t>var</w:t>
       </w:r>
       <w:proofErr w:type="spellEnd"/>
       <w:r>
-        <w:rPr>
-          <w:b/>
-          <w:bCs/>
-        </w:rPr>
-        <w:t xml:space="preserve"> (stochastic, time-varying Ne/Nc):</w:t>
-      </w:r>
-      <w:r>
-        <w:t xml:space="preserve"> Ne/Nc ratio changes from </w:t>
+        <w:t xml:space="preserve"> (stochastic, time-varying Ne/Nc): Ne/Nc ratio changes from </w:t>
       </w:r>
       <w:r>
         <w:rPr>
@@ -3423,229 +3502,32 @@
             <w:rPr>
               <w:rStyle w:val="VerbatimChar"/>
               <w:rFonts w:ascii="Cambria Math" w:hAnsi="Cambria Math"/>
+              <w:sz w:val="18"/>
+              <w:szCs w:val="20"/>
             </w:rPr>
-            <m:t>ratio</m:t>
+            <m:t>ratio(t)= ratio_end- (ratio_end- ratio_start )·</m:t>
           </m:r>
-          <m:d>
-            <m:dPr>
-              <m:ctrlPr>
-                <w:rPr>
-                  <w:rStyle w:val="VerbatimChar"/>
-                  <w:rFonts w:ascii="Cambria Math" w:hAnsi="Cambria Math"/>
-                  <w:i/>
-                </w:rPr>
-              </m:ctrlPr>
-            </m:dPr>
-            <m:e>
-              <m:r>
-                <w:rPr>
-                  <w:rStyle w:val="VerbatimChar"/>
-                  <w:rFonts w:ascii="Cambria Math" w:hAnsi="Cambria Math"/>
-                </w:rPr>
-                <m:t>t</m:t>
-              </m:r>
-            </m:e>
-          </m:d>
+          <m:r>
+            <m:rPr>
+              <m:sty m:val="p"/>
+            </m:rPr>
+            <w:rPr>
+              <w:rStyle w:val="VerbatimChar"/>
+              <w:rFonts w:ascii="Cambria Math" w:hAnsi="Cambria Math"/>
+              <w:sz w:val="18"/>
+              <w:szCs w:val="20"/>
+            </w:rPr>
+            <m:t>exp⁡</m:t>
+          </m:r>
           <m:r>
             <w:rPr>
               <w:rStyle w:val="VerbatimChar"/>
               <w:rFonts w:ascii="Cambria Math" w:hAnsi="Cambria Math"/>
+              <w:sz w:val="18"/>
+              <w:szCs w:val="20"/>
             </w:rPr>
-            <m:t>= rati</m:t>
+            <m:t>(-t/τ)</m:t>
           </m:r>
-          <m:sSub>
-            <m:sSubPr>
-              <m:ctrlPr>
-                <w:rPr>
-                  <w:rStyle w:val="VerbatimChar"/>
-                  <w:rFonts w:ascii="Cambria Math" w:hAnsi="Cambria Math"/>
-                  <w:i/>
-                </w:rPr>
-              </m:ctrlPr>
-            </m:sSubPr>
-            <m:e>
-              <m:r>
-                <w:rPr>
-                  <w:rStyle w:val="VerbatimChar"/>
-                  <w:rFonts w:ascii="Cambria Math" w:hAnsi="Cambria Math"/>
-                </w:rPr>
-                <m:t>o</m:t>
-              </m:r>
-            </m:e>
-            <m:sub>
-              <m:r>
-                <w:rPr>
-                  <w:rStyle w:val="VerbatimChar"/>
-                  <w:rFonts w:ascii="Cambria Math" w:hAnsi="Cambria Math"/>
-                </w:rPr>
-                <m:t>end</m:t>
-              </m:r>
-            </m:sub>
-          </m:sSub>
-          <m:r>
-            <w:rPr>
-              <w:rStyle w:val="VerbatimChar"/>
-              <w:rFonts w:ascii="Cambria Math" w:hAnsi="Cambria Math"/>
-            </w:rPr>
-            <m:t xml:space="preserve">- </m:t>
-          </m:r>
-          <m:d>
-            <m:dPr>
-              <m:ctrlPr>
-                <w:rPr>
-                  <w:rStyle w:val="VerbatimChar"/>
-                  <w:rFonts w:ascii="Cambria Math" w:hAnsi="Cambria Math"/>
-                  <w:i/>
-                </w:rPr>
-              </m:ctrlPr>
-            </m:dPr>
-            <m:e>
-              <m:r>
-                <w:rPr>
-                  <w:rStyle w:val="VerbatimChar"/>
-                  <w:rFonts w:ascii="Cambria Math" w:hAnsi="Cambria Math"/>
-                </w:rPr>
-                <m:t>rati</m:t>
-              </m:r>
-              <m:sSub>
-                <m:sSubPr>
-                  <m:ctrlPr>
-                    <w:rPr>
-                      <w:rStyle w:val="VerbatimChar"/>
-                      <w:rFonts w:ascii="Cambria Math" w:hAnsi="Cambria Math"/>
-                      <w:i/>
-                    </w:rPr>
-                  </m:ctrlPr>
-                </m:sSubPr>
-                <m:e>
-                  <m:r>
-                    <w:rPr>
-                      <w:rStyle w:val="VerbatimChar"/>
-                      <w:rFonts w:ascii="Cambria Math" w:hAnsi="Cambria Math"/>
-                    </w:rPr>
-                    <m:t>o</m:t>
-                  </m:r>
-                </m:e>
-                <m:sub>
-                  <m:r>
-                    <w:rPr>
-                      <w:rStyle w:val="VerbatimChar"/>
-                      <w:rFonts w:ascii="Cambria Math" w:hAnsi="Cambria Math"/>
-                    </w:rPr>
-                    <m:t>end</m:t>
-                  </m:r>
-                </m:sub>
-              </m:sSub>
-              <m:r>
-                <w:rPr>
-                  <w:rStyle w:val="VerbatimChar"/>
-                  <w:rFonts w:ascii="Cambria Math" w:hAnsi="Cambria Math"/>
-                </w:rPr>
-                <m:t>- rati</m:t>
-              </m:r>
-              <m:sSub>
-                <m:sSubPr>
-                  <m:ctrlPr>
-                    <w:rPr>
-                      <w:rStyle w:val="VerbatimChar"/>
-                      <w:rFonts w:ascii="Cambria Math" w:hAnsi="Cambria Math"/>
-                      <w:i/>
-                    </w:rPr>
-                  </m:ctrlPr>
-                </m:sSubPr>
-                <m:e>
-                  <m:r>
-                    <w:rPr>
-                      <w:rStyle w:val="VerbatimChar"/>
-                      <w:rFonts w:ascii="Cambria Math" w:hAnsi="Cambria Math"/>
-                    </w:rPr>
-                    <m:t>o</m:t>
-                  </m:r>
-                </m:e>
-                <m:sub>
-                  <m:r>
-                    <w:rPr>
-                      <w:rStyle w:val="VerbatimChar"/>
-                      <w:rFonts w:ascii="Cambria Math" w:hAnsi="Cambria Math"/>
-                    </w:rPr>
-                    <m:t>start</m:t>
-                  </m:r>
-                </m:sub>
-              </m:sSub>
-            </m:e>
-          </m:d>
-          <m:r>
-            <w:rPr>
-              <w:rStyle w:val="VerbatimChar"/>
-              <w:rFonts w:ascii="Cambria Math" w:hAnsi="Cambria Math"/>
-            </w:rPr>
-            <m:t>·</m:t>
-          </m:r>
-          <m:func>
-            <m:funcPr>
-              <m:ctrlPr>
-                <w:rPr>
-                  <w:rStyle w:val="VerbatimChar"/>
-                  <w:rFonts w:ascii="Cambria Math" w:hAnsi="Cambria Math"/>
-                </w:rPr>
-              </m:ctrlPr>
-            </m:funcPr>
-            <m:fName>
-              <m:r>
-                <m:rPr>
-                  <m:sty m:val="p"/>
-                </m:rPr>
-                <w:rPr>
-                  <w:rStyle w:val="VerbatimChar"/>
-                  <w:rFonts w:ascii="Cambria Math" w:hAnsi="Cambria Math"/>
-                </w:rPr>
-                <m:t>exp</m:t>
-              </m:r>
-              <m:ctrlPr>
-                <w:rPr>
-                  <w:rStyle w:val="VerbatimChar"/>
-                  <w:rFonts w:ascii="Cambria Math" w:hAnsi="Cambria Math"/>
-                  <w:i/>
-                </w:rPr>
-              </m:ctrlPr>
-            </m:fName>
-            <m:e>
-              <m:d>
-                <m:dPr>
-                  <m:ctrlPr>
-                    <w:rPr>
-                      <w:rStyle w:val="VerbatimChar"/>
-                      <w:rFonts w:ascii="Cambria Math" w:hAnsi="Cambria Math"/>
-                      <w:i/>
-                    </w:rPr>
-                  </m:ctrlPr>
-                </m:dPr>
-                <m:e>
-                  <m:r>
-                    <w:rPr>
-                      <w:rStyle w:val="VerbatimChar"/>
-                      <w:rFonts w:ascii="Cambria Math" w:hAnsi="Cambria Math"/>
-                    </w:rPr>
-                    <m:t>-t</m:t>
-                  </m:r>
-                  <m:r>
-                    <w:rPr>
-                      <w:rStyle w:val="VerbatimChar"/>
-                      <w:rFonts w:ascii="Cambria Math" w:hAnsi="Cambria Math"/>
-                    </w:rPr>
-                    <m:t>/</m:t>
-                  </m:r>
-                  <m:r>
-                    <w:rPr>
-                      <w:rStyle w:val="VerbatimChar"/>
-                      <w:rFonts w:ascii="Cambria Math" w:hAnsi="Cambria Math"/>
-                    </w:rPr>
-                    <m:t>τ</m:t>
-                  </m:r>
-                </m:e>
-              </m:d>
-            </m:e>
-          </m:func>
         </m:oMath>
       </m:oMathPara>
     </w:p>
@@ -3654,7 +3536,15 @@
         <w:pStyle w:val="FirstParagraph"/>
       </w:pPr>
       <w:r>
-        <w:t xml:space="preserve">Generational Ne at time t: </w:t>
+        <w:t>Generational Ne at time t:</w:t>
+      </w:r>
+    </w:p>
+    <w:p>
+      <w:pPr>
+        <w:pStyle w:val="FirstParagraph"/>
+      </w:pPr>
+      <w:r>
+        <w:t xml:space="preserve"> </w:t>
       </w:r>
       <m:oMath>
         <m:r>
@@ -3783,10 +3673,7 @@
         </m:d>
       </m:oMath>
       <w:r>
-        <w:t xml:space="preserve"> </w:t>
-      </w:r>
-      <w:r>
-        <w:t>is the mean across 2000 stochastic replicates.</w:t>
+        <w:t xml:space="preserve"> is the mean across 2000 stochastic replicates.</w:t>
       </w:r>
     </w:p>
     <w:p>
@@ -3812,8 +3699,36 @@
       <w:pPr>
         <w:pStyle w:val="FirstParagraph"/>
       </w:pPr>
-      <w:r>
-        <w:t xml:space="preserve">B_link is the most mechanistically integrated sub-model. It first simulates demographic trajectories using C-style assumptions (Ne-sensitive </w:t>
+      <m:oMath>
+        <m:sSub>
+          <m:sSubPr>
+            <m:ctrlPr>
+              <w:rPr>
+                <w:rFonts w:ascii="Cambria Math" w:eastAsiaTheme="majorEastAsia" w:hAnsi="Cambria Math" w:cstheme="majorBidi"/>
+                <w:i/>
+              </w:rPr>
+            </m:ctrlPr>
+          </m:sSubPr>
+          <m:e>
+            <m:r>
+              <w:rPr>
+                <w:rFonts w:ascii="Cambria Math" w:eastAsiaTheme="majorEastAsia" w:hAnsi="Cambria Math" w:cstheme="majorBidi"/>
+              </w:rPr>
+              <m:t>B</m:t>
+            </m:r>
+          </m:e>
+          <m:sub>
+            <m:r>
+              <w:rPr>
+                <w:rFonts w:ascii="Cambria Math" w:eastAsiaTheme="majorEastAsia" w:hAnsi="Cambria Math" w:cstheme="majorBidi"/>
+              </w:rPr>
+              <m:t>link</m:t>
+            </m:r>
+          </m:sub>
+        </m:sSub>
+      </m:oMath>
+      <w:r>
+        <w:t xml:space="preserve"> is the most mechanistically integrated sub-model. It first simulates demographic trajectories using C-style assumptions (Ne-sensitive </w:t>
       </w:r>
       <m:oMath>
         <m:sSub>
@@ -3857,6 +3772,8 @@
             <w:rPr>
               <w:rStyle w:val="VerbatimChar"/>
               <w:rFonts w:ascii="Cambria Math" w:hAnsi="Cambria Math"/>
+              <w:sz w:val="20"/>
+              <w:szCs w:val="22"/>
             </w:rPr>
             <m:t>N</m:t>
           </m:r>
@@ -3867,6 +3784,8 @@
                   <w:rStyle w:val="VerbatimChar"/>
                   <w:rFonts w:ascii="Cambria Math" w:hAnsi="Cambria Math"/>
                   <w:i/>
+                  <w:sz w:val="20"/>
+                  <w:szCs w:val="22"/>
                 </w:rPr>
               </m:ctrlPr>
             </m:sSubPr>
@@ -3875,6 +3794,8 @@
                 <w:rPr>
                   <w:rStyle w:val="VerbatimChar"/>
                   <w:rFonts w:ascii="Cambria Math" w:hAnsi="Cambria Math"/>
+                  <w:sz w:val="20"/>
+                  <w:szCs w:val="22"/>
                 </w:rPr>
                 <m:t>e</m:t>
               </m:r>
@@ -3884,6 +3805,8 @@
                 <w:rPr>
                   <w:rStyle w:val="VerbatimChar"/>
                   <w:rFonts w:ascii="Cambria Math" w:hAnsi="Cambria Math"/>
+                  <w:sz w:val="20"/>
+                  <w:szCs w:val="22"/>
                 </w:rPr>
                 <m:t>g</m:t>
               </m:r>
@@ -3894,6 +3817,8 @@
                       <w:rStyle w:val="VerbatimChar"/>
                       <w:rFonts w:ascii="Cambria Math" w:hAnsi="Cambria Math"/>
                       <w:i/>
+                      <w:sz w:val="20"/>
+                      <w:szCs w:val="22"/>
                     </w:rPr>
                   </m:ctrlPr>
                 </m:dPr>
@@ -3902,6 +3827,8 @@
                     <w:rPr>
                       <w:rStyle w:val="VerbatimChar"/>
                       <w:rFonts w:ascii="Cambria Math" w:hAnsi="Cambria Math"/>
+                      <w:sz w:val="20"/>
+                      <w:szCs w:val="22"/>
                     </w:rPr>
                     <m:t>t</m:t>
                   </m:r>
@@ -3913,6 +3840,8 @@
             <w:rPr>
               <w:rStyle w:val="VerbatimChar"/>
               <w:rFonts w:ascii="Cambria Math" w:hAnsi="Cambria Math"/>
+              <w:sz w:val="20"/>
+              <w:szCs w:val="22"/>
             </w:rPr>
             <m:t>= ratio</m:t>
           </m:r>
@@ -3923,6 +3852,8 @@
                   <w:rStyle w:val="VerbatimChar"/>
                   <w:rFonts w:ascii="Cambria Math" w:hAnsi="Cambria Math"/>
                   <w:i/>
+                  <w:sz w:val="20"/>
+                  <w:szCs w:val="22"/>
                 </w:rPr>
               </m:ctrlPr>
             </m:dPr>
@@ -3931,6 +3862,8 @@
                 <w:rPr>
                   <w:rStyle w:val="VerbatimChar"/>
                   <w:rFonts w:ascii="Cambria Math" w:hAnsi="Cambria Math"/>
+                  <w:sz w:val="20"/>
+                  <w:szCs w:val="22"/>
                 </w:rPr>
                 <m:t>t</m:t>
               </m:r>
@@ -3940,6 +3873,8 @@
             <w:rPr>
               <w:rStyle w:val="VerbatimChar"/>
               <w:rFonts w:ascii="Cambria Math" w:hAnsi="Cambria Math"/>
+              <w:sz w:val="20"/>
+              <w:szCs w:val="22"/>
             </w:rPr>
             <m:t>× Nc</m:t>
           </m:r>
@@ -3950,6 +3885,8 @@
                   <w:rStyle w:val="VerbatimChar"/>
                   <w:rFonts w:ascii="Cambria Math" w:hAnsi="Cambria Math"/>
                   <w:i/>
+                  <w:sz w:val="20"/>
+                  <w:szCs w:val="22"/>
                 </w:rPr>
               </m:ctrlPr>
             </m:dPr>
@@ -3958,6 +3895,8 @@
                 <w:rPr>
                   <w:rStyle w:val="VerbatimChar"/>
                   <w:rFonts w:ascii="Cambria Math" w:hAnsi="Cambria Math"/>
+                  <w:sz w:val="20"/>
+                  <w:szCs w:val="22"/>
                 </w:rPr>
                 <m:t>t</m:t>
               </m:r>
@@ -3967,6 +3906,8 @@
             <w:rPr>
               <w:rStyle w:val="VerbatimChar"/>
               <w:rFonts w:ascii="Cambria Math" w:hAnsi="Cambria Math"/>
+              <w:sz w:val="20"/>
+              <w:szCs w:val="22"/>
             </w:rPr>
             <m:t>× abundanc</m:t>
           </m:r>
@@ -3977,6 +3918,8 @@
                   <w:rStyle w:val="VerbatimChar"/>
                   <w:rFonts w:ascii="Cambria Math" w:hAnsi="Cambria Math"/>
                   <w:i/>
+                  <w:sz w:val="20"/>
+                  <w:szCs w:val="22"/>
                 </w:rPr>
               </m:ctrlPr>
             </m:sSubPr>
@@ -3985,6 +3928,8 @@
                 <w:rPr>
                   <w:rStyle w:val="VerbatimChar"/>
                   <w:rFonts w:ascii="Cambria Math" w:hAnsi="Cambria Math"/>
+                  <w:sz w:val="20"/>
+                  <w:szCs w:val="22"/>
                 </w:rPr>
                 <m:t>e</m:t>
               </m:r>
@@ -3994,6 +3939,8 @@
                 <w:rPr>
                   <w:rStyle w:val="VerbatimChar"/>
                   <w:rFonts w:ascii="Cambria Math" w:hAnsi="Cambria Math"/>
+                  <w:sz w:val="20"/>
+                  <w:szCs w:val="22"/>
                 </w:rPr>
                 <m:t>factor</m:t>
               </m:r>
@@ -4004,6 +3951,8 @@
                       <w:rStyle w:val="VerbatimChar"/>
                       <w:rFonts w:ascii="Cambria Math" w:hAnsi="Cambria Math"/>
                       <w:i/>
+                      <w:sz w:val="20"/>
+                      <w:szCs w:val="22"/>
                     </w:rPr>
                   </m:ctrlPr>
                 </m:dPr>
@@ -4012,6 +3961,8 @@
                     <w:rPr>
                       <w:rStyle w:val="VerbatimChar"/>
                       <w:rFonts w:ascii="Cambria Math" w:hAnsi="Cambria Math"/>
+                      <w:sz w:val="20"/>
+                      <w:szCs w:val="22"/>
                     </w:rPr>
                     <m:t>t</m:t>
                   </m:r>
@@ -4023,6 +3974,8 @@
             <w:rPr>
               <w:rStyle w:val="VerbatimChar"/>
               <w:rFonts w:ascii="Cambria Math" w:hAnsi="Cambria Math"/>
+              <w:sz w:val="20"/>
+              <w:szCs w:val="22"/>
             </w:rPr>
             <m:t>× multiplier</m:t>
           </m:r>
@@ -4071,10 +4024,7 @@
         </m:sSub>
       </m:oMath>
       <w:r>
-        <w:t xml:space="preserve"> </w:t>
-      </w:r>
-      <w:r>
-        <w:t>is a Michaelis-Menten saturation function:</w:t>
+        <w:t xml:space="preserve"> is a Michaelis-Menten saturation function:</w:t>
       </w:r>
     </w:p>
     <w:p>
@@ -4296,6 +4246,7 @@
     <w:p>
       <w:pPr>
         <w:pStyle w:val="Indragetstycke"/>
+        <w:ind w:right="-52"/>
       </w:pPr>
       <w:r>
         <w:rPr>
@@ -4389,7 +4340,13 @@
       <w:bookmarkStart w:id="19" w:name="sub-model-c-ne-sensitive-demography"/>
       <w:bookmarkEnd w:id="18"/>
       <w:r>
-        <w:t>Sub-model C: Ne-sensitive Demography</w:t>
+        <w:t xml:space="preserve">Sub-model C: </w:t>
+      </w:r>
+      <w:r>
+        <w:br/>
+      </w:r>
+      <w:r>
+        <w:t>Ne-sensitive Demography</w:t>
       </w:r>
     </w:p>
     <w:p>
@@ -4520,7 +4477,6 @@
               <w:rStyle w:val="VerbatimChar"/>
               <w:rFonts w:ascii="Cambria Math" w:hAnsi="Cambria Math"/>
             </w:rPr>
-            <w:lastRenderedPageBreak/>
             <m:t>MET</m:t>
           </m:r>
           <m:sSub>
@@ -4804,19 +4760,7 @@
           <w:rPr>
             <w:rFonts w:ascii="Cambria Math" w:hAnsi="Cambria Math"/>
           </w:rPr>
-          <m:t>= 0.3</m:t>
-        </m:r>
-        <m:r>
-          <w:rPr>
-            <w:rFonts w:ascii="Cambria Math" w:hAnsi="Cambria Math"/>
-          </w:rPr>
-          <m:t>3</m:t>
-        </m:r>
-        <m:r>
-          <w:rPr>
-            <w:rFonts w:ascii="Cambria Math" w:hAnsi="Cambria Math"/>
-          </w:rPr>
-          <m:t xml:space="preserve">, </m:t>
+          <m:t xml:space="preserve">= 0.33, </m:t>
         </m:r>
         <m:sSub>
           <m:sSubPr>
@@ -4933,10 +4877,7 @@
         </m:d>
       </m:oMath>
       <w:r>
-        <w:t xml:space="preserve"> </w:t>
-      </w:r>
-      <w:r>
-        <w:t xml:space="preserve">is used (not </w:t>
+        <w:t xml:space="preserve"> is used (not </w:t>
       </w:r>
       <m:oMath>
         <m:r>
@@ -4987,12 +4928,14 @@
       <w:r>
         <w:t xml:space="preserve">) because it is the most mechanistically integrated genetic estimate. Viability criterion: </w:t>
       </w:r>
+      <w:proofErr w:type="spellStart"/>
       <w:r>
         <w:rPr>
           <w:rFonts w:ascii="Consolas" w:hAnsi="Consolas"/>
         </w:rPr>
         <w:t>META_survival</w:t>
       </w:r>
+      <w:proofErr w:type="spellEnd"/>
       <w:r>
         <w:t xml:space="preserve"> ≥ 0.95.</w:t>
       </w:r>
@@ -5004,10 +4947,7 @@
       <w:bookmarkStart w:id="21" w:name="disturbance-model"/>
       <w:bookmarkEnd w:id="20"/>
       <w:r>
-        <w:t>D</w:t>
-      </w:r>
-      <w:r>
-        <w:t>isturbance Model</w:t>
+        <w:t>Disturbance Model</w:t>
       </w:r>
     </w:p>
     <w:p>
@@ -5046,10 +4986,7 @@
         </m:sSub>
       </m:oMath>
       <w:r>
-        <w:t xml:space="preserve"> </w:t>
-      </w:r>
-      <w:r>
-        <w:t>exponentially and relaxes over time:</w:t>
+        <w:t xml:space="preserve"> exponentially and relaxes over time:</w:t>
       </w:r>
     </w:p>
     <w:p>
@@ -5057,11 +4994,16 @@
         <w:pStyle w:val="SourceCode"/>
       </w:pPr>
       <m:oMathPara>
+        <m:oMathParaPr>
+          <m:jc m:val="center"/>
+        </m:oMathParaPr>
         <m:oMath>
           <m:r>
             <w:rPr>
               <w:rStyle w:val="VerbatimChar"/>
               <w:rFonts w:ascii="Cambria Math" w:hAnsi="Cambria Math"/>
+              <w:sz w:val="20"/>
+              <w:szCs w:val="22"/>
             </w:rPr>
             <m:t>distur</m:t>
           </m:r>
@@ -5072,6 +5014,8 @@
                   <w:rStyle w:val="VerbatimChar"/>
                   <w:rFonts w:ascii="Cambria Math" w:hAnsi="Cambria Math"/>
                   <w:i/>
+                  <w:sz w:val="20"/>
+                  <w:szCs w:val="22"/>
                 </w:rPr>
               </m:ctrlPr>
             </m:sSubPr>
@@ -5080,6 +5024,8 @@
                 <w:rPr>
                   <w:rStyle w:val="VerbatimChar"/>
                   <w:rFonts w:ascii="Cambria Math" w:hAnsi="Cambria Math"/>
+                  <w:sz w:val="20"/>
+                  <w:szCs w:val="22"/>
                 </w:rPr>
                 <m:t>b</m:t>
               </m:r>
@@ -5089,6 +5035,8 @@
                 <w:rPr>
                   <w:rStyle w:val="VerbatimChar"/>
                   <w:rFonts w:ascii="Cambria Math" w:hAnsi="Cambria Math"/>
+                  <w:sz w:val="20"/>
+                  <w:szCs w:val="22"/>
                 </w:rPr>
                 <m:t>factor</m:t>
               </m:r>
@@ -5099,6 +5047,8 @@
                       <w:rStyle w:val="VerbatimChar"/>
                       <w:rFonts w:ascii="Cambria Math" w:hAnsi="Cambria Math"/>
                       <w:i/>
+                      <w:sz w:val="20"/>
+                      <w:szCs w:val="22"/>
                     </w:rPr>
                   </m:ctrlPr>
                 </m:dPr>
@@ -5107,6 +5057,8 @@
                     <w:rPr>
                       <w:rStyle w:val="VerbatimChar"/>
                       <w:rFonts w:ascii="Cambria Math" w:hAnsi="Cambria Math"/>
+                      <w:sz w:val="20"/>
+                      <w:szCs w:val="22"/>
                     </w:rPr>
                     <m:t>t</m:t>
                   </m:r>
@@ -5118,6 +5070,8 @@
             <w:rPr>
               <w:rStyle w:val="VerbatimChar"/>
               <w:rFonts w:ascii="Cambria Math" w:hAnsi="Cambria Math"/>
+              <w:sz w:val="20"/>
+              <w:szCs w:val="22"/>
             </w:rPr>
             <m:t xml:space="preserve">= </m:t>
           </m:r>
@@ -5128,6 +5082,8 @@
                   <w:rStyle w:val="VerbatimChar"/>
                   <w:rFonts w:ascii="Cambria Math" w:hAnsi="Cambria Math"/>
                   <w:i/>
+                  <w:sz w:val="20"/>
+                  <w:szCs w:val="22"/>
                 </w:rPr>
               </m:ctrlPr>
             </m:sSubPr>
@@ -5136,6 +5092,8 @@
                 <w:rPr>
                   <w:rStyle w:val="VerbatimChar"/>
                   <w:rFonts w:ascii="Cambria Math" w:hAnsi="Cambria Math"/>
+                  <w:sz w:val="20"/>
+                  <w:szCs w:val="22"/>
                 </w:rPr>
                 <m:t>f</m:t>
               </m:r>
@@ -5145,6 +5103,8 @@
                 <w:rPr>
                   <w:rStyle w:val="VerbatimChar"/>
                   <w:rFonts w:ascii="Cambria Math" w:hAnsi="Cambria Math"/>
+                  <w:sz w:val="20"/>
+                  <w:szCs w:val="22"/>
                 </w:rPr>
                 <m:t>end</m:t>
               </m:r>
@@ -5154,6 +5114,8 @@
             <w:rPr>
               <w:rStyle w:val="VerbatimChar"/>
               <w:rFonts w:ascii="Cambria Math" w:hAnsi="Cambria Math"/>
+              <w:sz w:val="20"/>
+              <w:szCs w:val="22"/>
             </w:rPr>
             <m:t xml:space="preserve">+ </m:t>
           </m:r>
@@ -5164,6 +5126,8 @@
                   <w:rStyle w:val="VerbatimChar"/>
                   <w:rFonts w:ascii="Cambria Math" w:hAnsi="Cambria Math"/>
                   <w:i/>
+                  <w:sz w:val="20"/>
+                  <w:szCs w:val="22"/>
                 </w:rPr>
               </m:ctrlPr>
             </m:dPr>
@@ -5175,6 +5139,8 @@
                       <w:rStyle w:val="VerbatimChar"/>
                       <w:rFonts w:ascii="Cambria Math" w:hAnsi="Cambria Math"/>
                       <w:i/>
+                      <w:sz w:val="20"/>
+                      <w:szCs w:val="22"/>
                     </w:rPr>
                   </m:ctrlPr>
                 </m:sSubPr>
@@ -5183,6 +5149,8 @@
                     <w:rPr>
                       <w:rStyle w:val="VerbatimChar"/>
                       <w:rFonts w:ascii="Cambria Math" w:hAnsi="Cambria Math"/>
+                      <w:sz w:val="20"/>
+                      <w:szCs w:val="22"/>
                     </w:rPr>
                     <m:t>f</m:t>
                   </m:r>
@@ -5192,6 +5160,8 @@
                     <w:rPr>
                       <w:rStyle w:val="VerbatimChar"/>
                       <w:rFonts w:ascii="Cambria Math" w:hAnsi="Cambria Math"/>
+                      <w:sz w:val="20"/>
+                      <w:szCs w:val="22"/>
                     </w:rPr>
                     <m:t>start</m:t>
                   </m:r>
@@ -5201,6 +5171,8 @@
                 <w:rPr>
                   <w:rStyle w:val="VerbatimChar"/>
                   <w:rFonts w:ascii="Cambria Math" w:hAnsi="Cambria Math"/>
+                  <w:sz w:val="20"/>
+                  <w:szCs w:val="22"/>
                 </w:rPr>
                 <m:t xml:space="preserve">- </m:t>
               </m:r>
@@ -5211,6 +5183,8 @@
                       <w:rStyle w:val="VerbatimChar"/>
                       <w:rFonts w:ascii="Cambria Math" w:hAnsi="Cambria Math"/>
                       <w:i/>
+                      <w:sz w:val="20"/>
+                      <w:szCs w:val="22"/>
                     </w:rPr>
                   </m:ctrlPr>
                 </m:sSubPr>
@@ -5219,6 +5193,8 @@
                     <w:rPr>
                       <w:rStyle w:val="VerbatimChar"/>
                       <w:rFonts w:ascii="Cambria Math" w:hAnsi="Cambria Math"/>
+                      <w:sz w:val="20"/>
+                      <w:szCs w:val="22"/>
                     </w:rPr>
                     <m:t>f</m:t>
                   </m:r>
@@ -5228,6 +5204,8 @@
                     <w:rPr>
                       <w:rStyle w:val="VerbatimChar"/>
                       <w:rFonts w:ascii="Cambria Math" w:hAnsi="Cambria Math"/>
+                      <w:sz w:val="20"/>
+                      <w:szCs w:val="22"/>
                     </w:rPr>
                     <m:t>end</m:t>
                   </m:r>
@@ -5239,6 +5217,8 @@
             <w:rPr>
               <w:rStyle w:val="VerbatimChar"/>
               <w:rFonts w:ascii="Cambria Math" w:hAnsi="Cambria Math"/>
+              <w:sz w:val="20"/>
+              <w:szCs w:val="22"/>
             </w:rPr>
             <m:t>·</m:t>
           </m:r>
@@ -5248,6 +5228,8 @@
                 <w:rPr>
                   <w:rStyle w:val="VerbatimChar"/>
                   <w:rFonts w:ascii="Cambria Math" w:hAnsi="Cambria Math"/>
+                  <w:sz w:val="20"/>
+                  <w:szCs w:val="22"/>
                 </w:rPr>
               </m:ctrlPr>
             </m:funcPr>
@@ -5259,6 +5241,8 @@
                 <w:rPr>
                   <w:rStyle w:val="VerbatimChar"/>
                   <w:rFonts w:ascii="Cambria Math" w:hAnsi="Cambria Math"/>
+                  <w:sz w:val="20"/>
+                  <w:szCs w:val="22"/>
                 </w:rPr>
                 <m:t>exp</m:t>
               </m:r>
@@ -5267,6 +5251,8 @@
                   <w:rStyle w:val="VerbatimChar"/>
                   <w:rFonts w:ascii="Cambria Math" w:hAnsi="Cambria Math"/>
                   <w:i/>
+                  <w:sz w:val="20"/>
+                  <w:szCs w:val="22"/>
                 </w:rPr>
               </m:ctrlPr>
             </m:fName>
@@ -5278,6 +5264,8 @@
                       <w:rStyle w:val="VerbatimChar"/>
                       <w:rFonts w:ascii="Cambria Math" w:hAnsi="Cambria Math"/>
                       <w:i/>
+                      <w:sz w:val="20"/>
+                      <w:szCs w:val="22"/>
                     </w:rPr>
                   </m:ctrlPr>
                 </m:dPr>
@@ -5289,6 +5277,8 @@
                           <w:rStyle w:val="VerbatimChar"/>
                           <w:rFonts w:ascii="Cambria Math" w:hAnsi="Cambria Math"/>
                           <w:i/>
+                          <w:sz w:val="20"/>
+                          <w:szCs w:val="22"/>
                         </w:rPr>
                       </m:ctrlPr>
                     </m:fPr>
@@ -5297,6 +5287,8 @@
                         <w:rPr>
                           <w:rStyle w:val="VerbatimChar"/>
                           <w:rFonts w:ascii="Cambria Math" w:hAnsi="Cambria Math"/>
+                          <w:sz w:val="20"/>
+                          <w:szCs w:val="22"/>
                         </w:rPr>
                         <m:t>-t</m:t>
                       </m:r>
@@ -5309,6 +5301,8 @@
                               <w:rStyle w:val="VerbatimChar"/>
                               <w:rFonts w:ascii="Cambria Math" w:hAnsi="Cambria Math"/>
                               <w:i/>
+                              <w:sz w:val="20"/>
+                              <w:szCs w:val="22"/>
                             </w:rPr>
                           </m:ctrlPr>
                         </m:sSubPr>
@@ -5317,6 +5311,8 @@
                             <w:rPr>
                               <w:rStyle w:val="VerbatimChar"/>
                               <w:rFonts w:ascii="Cambria Math" w:hAnsi="Cambria Math"/>
+                              <w:sz w:val="20"/>
+                              <w:szCs w:val="22"/>
                             </w:rPr>
                             <m:t>τ</m:t>
                           </m:r>
@@ -5326,6 +5322,8 @@
                             <w:rPr>
                               <w:rStyle w:val="VerbatimChar"/>
                               <w:rFonts w:ascii="Cambria Math" w:hAnsi="Cambria Math"/>
+                              <w:sz w:val="20"/>
+                              <w:szCs w:val="22"/>
                             </w:rPr>
                             <m:t>relax</m:t>
                           </m:r>
@@ -5345,6 +5343,7 @@
         <w:pStyle w:val="FirstParagraph"/>
       </w:pPr>
       <w:r>
+        <w:lastRenderedPageBreak/>
         <w:t xml:space="preserve">Set </w:t>
       </w:r>
       <w:r>
@@ -5363,11 +5362,28 @@
         <w:t>DISTURBANCE_RELAX_YEARS</w:t>
       </w:r>
       <w:r>
-        <w:t xml:space="preserve"> = 0 to disable (baseline scenario).</w:t>
+        <w:t xml:space="preserve"> = 0 to </w:t>
+      </w:r>
+      <w:r>
+        <w:t>disable (baseline scenario).</w:t>
       </w:r>
       <w:bookmarkStart w:id="22" w:name="key-equations-summary"/>
       <w:bookmarkEnd w:id="15"/>
       <w:bookmarkEnd w:id="21"/>
+    </w:p>
+    <w:p>
+      <w:pPr>
+        <w:pStyle w:val="Rubrik1"/>
+        <w:sectPr>
+          <w:footnotePr>
+            <w:numRestart w:val="eachSect"/>
+          </w:footnotePr>
+          <w:type w:val="continuous"/>
+          <w:pgSz w:w="12240" w:h="15840"/>
+          <w:pgMar w:top="1417" w:right="1417" w:bottom="1417" w:left="1417" w:header="720" w:footer="720" w:gutter="0"/>
+          <w:cols w:num="2" w:space="720"/>
+        </w:sectPr>
+      </w:pPr>
     </w:p>
     <w:p>
       <w:pPr>
@@ -5403,10 +5419,7 @@
               <w:pStyle w:val="Compact"/>
             </w:pPr>
             <w:r>
-              <w:t>S</w:t>
-            </w:r>
-            <w:r>
-              <w:t>ymbol / Equation</w:t>
+              <w:t>Symbol / Equation</w:t>
             </w:r>
           </w:p>
         </w:tc>
@@ -5553,7 +5566,15 @@
               <w:pStyle w:val="Compact"/>
             </w:pPr>
             <w:r>
-              <w:t>Annual drift, Ricker, Itô corrected</w:t>
+              <w:t xml:space="preserve">Annual drift, Ricker, </w:t>
+            </w:r>
+            <w:proofErr w:type="spellStart"/>
+            <w:r>
+              <w:t>Itô</w:t>
+            </w:r>
+            <w:proofErr w:type="spellEnd"/>
+            <w:r>
+              <w:t xml:space="preserve"> corrected</w:t>
             </w:r>
           </w:p>
         </w:tc>
@@ -6772,41 +6793,27 @@
           <w:p>
             <w:pPr>
               <w:pStyle w:val="Compact"/>
-              <w:rPr>
-                <w:lang w:val="sv-SE"/>
-              </w:rPr>
             </w:pPr>
             <w:r>
-              <w:rPr>
-                <w:lang w:val="sv-SE"/>
-              </w:rPr>
               <w:t xml:space="preserve">B, </w:t>
             </w:r>
             <w:proofErr w:type="spellStart"/>
             <w:r>
-              <w:rPr>
-                <w:lang w:val="sv-SE"/>
-              </w:rPr>
               <w:t>B</w:t>
             </w:r>
             <w:r>
               <w:rPr>
                 <w:vertAlign w:val="subscript"/>
-                <w:lang w:val="sv-SE"/>
               </w:rPr>
               <w:t>var</w:t>
             </w:r>
             <w:proofErr w:type="spellEnd"/>
             <w:r>
-              <w:rPr>
-                <w:lang w:val="sv-SE"/>
-              </w:rPr>
               <w:t>, B</w:t>
             </w:r>
             <w:r>
               <w:rPr>
                 <w:vertAlign w:val="subscript"/>
-                <w:lang w:val="sv-SE"/>
               </w:rPr>
               <w:t>link</w:t>
             </w:r>
@@ -6855,41 +6862,27 @@
           <w:p>
             <w:pPr>
               <w:pStyle w:val="Compact"/>
-              <w:rPr>
-                <w:lang w:val="sv-SE"/>
-              </w:rPr>
             </w:pPr>
             <w:r>
-              <w:rPr>
-                <w:lang w:val="sv-SE"/>
-              </w:rPr>
               <w:t xml:space="preserve">B, </w:t>
             </w:r>
             <w:proofErr w:type="spellStart"/>
             <w:r>
-              <w:rPr>
-                <w:lang w:val="sv-SE"/>
-              </w:rPr>
               <w:t>B</w:t>
             </w:r>
             <w:r>
               <w:rPr>
                 <w:vertAlign w:val="subscript"/>
-                <w:lang w:val="sv-SE"/>
               </w:rPr>
               <w:t>var</w:t>
             </w:r>
             <w:proofErr w:type="spellEnd"/>
             <w:r>
-              <w:rPr>
-                <w:lang w:val="sv-SE"/>
-              </w:rPr>
               <w:t>, B</w:t>
             </w:r>
             <w:r>
               <w:rPr>
                 <w:vertAlign w:val="subscript"/>
-                <w:lang w:val="sv-SE"/>
               </w:rPr>
               <w:t>link</w:t>
             </w:r>
@@ -7053,11 +7046,7 @@
               <w:pStyle w:val="Compact"/>
             </w:pPr>
             <w:r>
-              <w:t>Generational Ne in eco-</w:t>
-            </w:r>
-            <w:r>
-              <w:lastRenderedPageBreak/>
-              <w:t>genetic model</w:t>
+              <w:t>Generational Ne in eco-genetic model</w:t>
             </w:r>
           </w:p>
         </w:tc>
@@ -7070,7 +7059,6 @@
               <w:pStyle w:val="Compact"/>
             </w:pPr>
             <w:r>
-              <w:lastRenderedPageBreak/>
               <w:t>B</w:t>
             </w:r>
             <w:r>
@@ -7486,6 +7474,16 @@
               <w:t>Composite ranking score (lower = better)</w:t>
             </w:r>
           </w:p>
+          <w:p>
+            <w:pPr>
+              <w:pStyle w:val="Compact"/>
+            </w:pPr>
+          </w:p>
+          <w:p>
+            <w:pPr>
+              <w:pStyle w:val="Compact"/>
+            </w:pPr>
+          </w:p>
         </w:tc>
         <w:tc>
           <w:tcPr>
@@ -7505,9 +7503,87 @@
     <w:p>
       <w:pPr>
         <w:pStyle w:val="Rubrik1"/>
+        <w:sectPr>
+          <w:footnotePr>
+            <w:numRestart w:val="eachSect"/>
+          </w:footnotePr>
+          <w:type w:val="continuous"/>
+          <w:pgSz w:w="12240" w:h="15840"/>
+          <w:pgMar w:top="1417" w:right="1417" w:bottom="1417" w:left="1417" w:header="720" w:footer="720" w:gutter="0"/>
+          <w:cols w:space="720"/>
+        </w:sectPr>
       </w:pPr>
       <w:bookmarkStart w:id="23" w:name="output-figures-and-interpretation"/>
       <w:bookmarkEnd w:id="22"/>
+    </w:p>
+    <w:p>
+      <w:pPr>
+        <w:pStyle w:val="Rubrik1"/>
+      </w:pPr>
+      <w:r>
+        <w:drawing>
+          <wp:anchor distT="0" distB="0" distL="114300" distR="114300" simplePos="0" relativeHeight="251613184" behindDoc="0" locked="0" layoutInCell="1" allowOverlap="1" wp14:anchorId="2F971629" wp14:editId="711B22AF">
+            <wp:simplePos x="0" y="0"/>
+            <wp:positionH relativeFrom="column">
+              <wp:posOffset>2919730</wp:posOffset>
+            </wp:positionH>
+            <wp:positionV relativeFrom="paragraph">
+              <wp:posOffset>25400</wp:posOffset>
+            </wp:positionV>
+            <wp:extent cx="3167380" cy="1979930"/>
+            <wp:effectExtent l="0" t="0" r="0" b="0"/>
+            <wp:wrapSquare wrapText="bothSides"/>
+            <wp:docPr id="1085679400" name="Bildobjekt 2"/>
+            <wp:cNvGraphicFramePr>
+              <a:graphicFrameLocks xmlns:a="http://schemas.openxmlformats.org/drawingml/2006/main" noChangeAspect="1"/>
+            </wp:cNvGraphicFramePr>
+            <a:graphic xmlns:a="http://schemas.openxmlformats.org/drawingml/2006/main">
+              <a:graphicData uri="http://schemas.openxmlformats.org/drawingml/2006/picture">
+                <pic:pic xmlns:pic="http://schemas.openxmlformats.org/drawingml/2006/picture">
+                  <pic:nvPicPr>
+                    <pic:cNvPr id="0" name="Picture 6"/>
+                    <pic:cNvPicPr>
+                      <a:picLocks noChangeAspect="1" noChangeArrowheads="1"/>
+                    </pic:cNvPicPr>
+                  </pic:nvPicPr>
+                  <pic:blipFill>
+                    <a:blip r:embed="rId10" cstate="print">
+                      <a:extLst>
+                        <a:ext uri="{28A0092B-C50C-407E-A947-70E740481C1C}">
+                          <a14:useLocalDpi xmlns:a14="http://schemas.microsoft.com/office/drawing/2010/main" val="0"/>
+                        </a:ext>
+                      </a:extLst>
+                    </a:blip>
+                    <a:srcRect/>
+                    <a:stretch>
+                      <a:fillRect/>
+                    </a:stretch>
+                  </pic:blipFill>
+                  <pic:spPr bwMode="auto">
+                    <a:xfrm>
+                      <a:off x="0" y="0"/>
+                      <a:ext cx="3167380" cy="1979930"/>
+                    </a:xfrm>
+                    <a:prstGeom prst="rect">
+                      <a:avLst/>
+                    </a:prstGeom>
+                    <a:noFill/>
+                    <a:ln>
+                      <a:noFill/>
+                    </a:ln>
+                  </pic:spPr>
+                </pic:pic>
+              </a:graphicData>
+            </a:graphic>
+            <wp14:sizeRelH relativeFrom="margin">
+              <wp14:pctWidth>0</wp14:pctWidth>
+            </wp14:sizeRelH>
+            <wp14:sizeRelV relativeFrom="margin">
+              <wp14:pctHeight>0</wp14:pctHeight>
+            </wp14:sizeRelV>
+          </wp:anchor>
+        </w:drawing>
+      </w:r>
       <w:r>
         <w:t>Output Figures and Interpretation</w:t>
       </w:r>
@@ -7527,27 +7603,6 @@
       <w:bookmarkStart w:id="24" w:name="figure-a-density-regulated-survival"/>
       <w:r>
         <w:t>Figure A — Density-regulated Survival</w:t>
-      </w:r>
-    </w:p>
-    <w:p>
-      <w:pPr>
-        <w:pStyle w:val="FirstParagraph"/>
-      </w:pPr>
-      <w:r>
-        <w:rPr>
-          <w:b/>
-          <w:bCs/>
-        </w:rPr>
-        <w:t>File:</w:t>
-      </w:r>
-      <w:r>
-        <w:t xml:space="preserve"> </w:t>
-      </w:r>
-      <w:r>
-        <w:rPr>
-          <w:rStyle w:val="VerbatimChar"/>
-        </w:rPr>
-        <w:t>mod_A_survival_density_demography.png</w:t>
       </w:r>
     </w:p>
     <w:p>
@@ -7615,6 +7670,7 @@
           <w:i/>
           <w:iCs/>
         </w:rPr>
+        <w:lastRenderedPageBreak/>
         <w:t>How to read:</w:t>
       </w:r>
       <w:r>
@@ -7633,29 +7689,71 @@
     </w:p>
     <w:p>
       <w:pPr>
-        <w:pStyle w:val="FirstParagraph"/>
-      </w:pPr>
-      <w:r>
-        <w:rPr>
-          <w:b/>
-          <w:bCs/>
-        </w:rPr>
-        <w:t>File:</w:t>
-      </w:r>
-      <w:r>
-        <w:t xml:space="preserve"> </w:t>
-      </w:r>
-      <w:r>
-        <w:rPr>
-          <w:rStyle w:val="VerbatimChar"/>
-        </w:rPr>
-        <w:t>mod_B_heterozygosity_genetics.png</w:t>
-      </w:r>
-    </w:p>
-    <w:p>
-      <w:pPr>
         <w:pStyle w:val="Brdtext"/>
       </w:pPr>
+      <w:r>
+        <w:drawing>
+          <wp:anchor distT="0" distB="0" distL="114300" distR="114300" simplePos="0" relativeHeight="251657216" behindDoc="0" locked="0" layoutInCell="1" allowOverlap="1" wp14:anchorId="53311DBC" wp14:editId="5E8E4148">
+            <wp:simplePos x="0" y="0"/>
+            <wp:positionH relativeFrom="column">
+              <wp:posOffset>-213995</wp:posOffset>
+            </wp:positionH>
+            <wp:positionV relativeFrom="paragraph">
+              <wp:posOffset>640715</wp:posOffset>
+            </wp:positionV>
+            <wp:extent cx="2969260" cy="1979295"/>
+            <wp:effectExtent l="0" t="0" r="0" b="0"/>
+            <wp:wrapSquare wrapText="bothSides"/>
+            <wp:docPr id="1132015357" name="Bildobjekt 4"/>
+            <wp:cNvGraphicFramePr>
+              <a:graphicFrameLocks xmlns:a="http://schemas.openxmlformats.org/drawingml/2006/main" noChangeAspect="1"/>
+            </wp:cNvGraphicFramePr>
+            <a:graphic xmlns:a="http://schemas.openxmlformats.org/drawingml/2006/main">
+              <a:graphicData uri="http://schemas.openxmlformats.org/drawingml/2006/picture">
+                <pic:pic xmlns:pic="http://schemas.openxmlformats.org/drawingml/2006/picture">
+                  <pic:nvPicPr>
+                    <pic:cNvPr id="1132015357" name="Bildobjekt 4"/>
+                    <pic:cNvPicPr>
+                      <a:picLocks noChangeAspect="1" noChangeArrowheads="1"/>
+                    </pic:cNvPicPr>
+                  </pic:nvPicPr>
+                  <pic:blipFill>
+                    <a:blip r:embed="rId11" cstate="print">
+                      <a:extLst>
+                        <a:ext uri="{28A0092B-C50C-407E-A947-70E740481C1C}">
+                          <a14:useLocalDpi xmlns:a14="http://schemas.microsoft.com/office/drawing/2010/main" val="0"/>
+                        </a:ext>
+                      </a:extLst>
+                    </a:blip>
+                    <a:stretch>
+                      <a:fillRect/>
+                    </a:stretch>
+                  </pic:blipFill>
+                  <pic:spPr bwMode="auto">
+                    <a:xfrm>
+                      <a:off x="0" y="0"/>
+                      <a:ext cx="2969260" cy="1979295"/>
+                    </a:xfrm>
+                    <a:prstGeom prst="rect">
+                      <a:avLst/>
+                    </a:prstGeom>
+                    <a:noFill/>
+                    <a:ln>
+                      <a:noFill/>
+                    </a:ln>
+                  </pic:spPr>
+                </pic:pic>
+              </a:graphicData>
+            </a:graphic>
+            <wp14:sizeRelH relativeFrom="margin">
+              <wp14:pctWidth>0</wp14:pctWidth>
+            </wp14:sizeRelH>
+            <wp14:sizeRelV relativeFrom="margin">
+              <wp14:pctHeight>0</wp14:pctHeight>
+            </wp14:sizeRelV>
+          </wp:anchor>
+        </w:drawing>
+      </w:r>
       <w:r>
         <w:t xml:space="preserve">Plots mean </w:t>
       </w:r>
@@ -7686,10 +7784,7 @@
         </m:d>
       </m:oMath>
       <w:r>
-        <w:t xml:space="preserve"> </w:t>
-      </w:r>
-      <w:r>
-        <w:t>over time for each combination of Ne/Nc ratio and immigration rate (B_var model), with bootstrap confidence intervals. The dotted horizontal line marks the 70% threshold (</w:t>
+        <w:t xml:space="preserve"> over time for each combination of Ne/Nc ratio and immigration rate (B_var model), with bootstrap confidence intervals. The dotted horizontal line marks the 70% threshold (</w:t>
       </w:r>
       <w:r>
         <w:rPr>
@@ -7724,10 +7819,7 @@
         </m:r>
       </m:oMath>
       <w:r>
-        <w:t xml:space="preserve"> </w:t>
-      </w:r>
-      <w:r>
-        <w:t>by a factor of ~3–4×.</w:t>
+        <w:t xml:space="preserve"> by a factor of ~3–4×.</w:t>
       </w:r>
     </w:p>
     <w:p>
@@ -7742,31 +7834,67 @@
     </w:p>
     <w:p>
       <w:pPr>
-        <w:pStyle w:val="FirstParagraph"/>
-      </w:pPr>
-      <w:r>
-        <w:rPr>
-          <w:b/>
-          <w:bCs/>
-        </w:rPr>
-        <w:t>File:</w:t>
-      </w:r>
-      <w:r>
-        <w:t xml:space="preserve"> </w:t>
-      </w:r>
-      <w:r>
-        <w:rPr>
-          <w:rStyle w:val="VerbatimChar"/>
-        </w:rPr>
-        <w:t>mod_C_survival_ne_sensitive.png</w:t>
-      </w:r>
-    </w:p>
-    <w:p>
-      <w:pPr>
         <w:pStyle w:val="Brdtext"/>
       </w:pPr>
       <w:r>
-        <w:lastRenderedPageBreak/>
+        <w:drawing>
+          <wp:anchor distT="0" distB="0" distL="114300" distR="114300" simplePos="0" relativeHeight="251720704" behindDoc="0" locked="0" layoutInCell="1" allowOverlap="1" wp14:anchorId="7815E2C8" wp14:editId="35D069F9">
+            <wp:simplePos x="0" y="0"/>
+            <wp:positionH relativeFrom="column">
+              <wp:posOffset>2216</wp:posOffset>
+            </wp:positionH>
+            <wp:positionV relativeFrom="paragraph">
+              <wp:posOffset>463238</wp:posOffset>
+            </wp:positionV>
+            <wp:extent cx="2757805" cy="1838325"/>
+            <wp:effectExtent l="0" t="0" r="0" b="0"/>
+            <wp:wrapSquare wrapText="bothSides"/>
+            <wp:docPr id="1976690730" name="Bildobjekt 3"/>
+            <wp:cNvGraphicFramePr>
+              <a:graphicFrameLocks xmlns:a="http://schemas.openxmlformats.org/drawingml/2006/main" noChangeAspect="1"/>
+            </wp:cNvGraphicFramePr>
+            <a:graphic xmlns:a="http://schemas.openxmlformats.org/drawingml/2006/main">
+              <a:graphicData uri="http://schemas.openxmlformats.org/drawingml/2006/picture">
+                <pic:pic xmlns:pic="http://schemas.openxmlformats.org/drawingml/2006/picture">
+                  <pic:nvPicPr>
+                    <pic:cNvPr id="0" name="Picture 10"/>
+                    <pic:cNvPicPr>
+                      <a:picLocks noChangeAspect="1" noChangeArrowheads="1"/>
+                    </pic:cNvPicPr>
+                  </pic:nvPicPr>
+                  <pic:blipFill>
+                    <a:blip r:embed="rId12" cstate="print">
+                      <a:extLst>
+                        <a:ext uri="{28A0092B-C50C-407E-A947-70E740481C1C}">
+                          <a14:useLocalDpi xmlns:a14="http://schemas.microsoft.com/office/drawing/2010/main" val="0"/>
+                        </a:ext>
+                      </a:extLst>
+                    </a:blip>
+                    <a:srcRect/>
+                    <a:stretch>
+                      <a:fillRect/>
+                    </a:stretch>
+                  </pic:blipFill>
+                  <pic:spPr bwMode="auto">
+                    <a:xfrm>
+                      <a:off x="0" y="0"/>
+                      <a:ext cx="2757805" cy="1838325"/>
+                    </a:xfrm>
+                    <a:prstGeom prst="rect">
+                      <a:avLst/>
+                    </a:prstGeom>
+                    <a:noFill/>
+                    <a:ln>
+                      <a:noFill/>
+                    </a:ln>
+                  </pic:spPr>
+                </pic:pic>
+              </a:graphicData>
+            </a:graphic>
+          </wp:anchor>
+        </w:drawing>
+      </w:r>
+      <w:r>
         <w:t xml:space="preserve">Analogous to Figure A but with </w:t>
       </w:r>
       <m:oMath>
@@ -7798,10 +7926,7 @@
         </m:sSub>
       </m:oMath>
       <w:r>
-        <w:t xml:space="preserve"> </w:t>
-      </w:r>
-      <w:r>
-        <w:t xml:space="preserve">replacing </w:t>
+        <w:t xml:space="preserve"> replacing </w:t>
       </w:r>
       <m:oMath>
         <m:sSub>
@@ -7832,7 +7957,18 @@
         </m:sSub>
       </m:oMath>
       <w:r>
-        <w:t>. This is the most conservative demographic viability estimate. The year at which a curve crosses 0.95 (if any) indicates the expected time to critical demographic failure.</w:t>
+        <w:t>. This is the most conservative demograph</w:t>
+      </w:r>
+      <w:r>
+        <w:t>ic viability estimate. The year at which a curve crosses 0.95 (if any) indicates the expected time to critical demographic failure.</w:t>
+      </w:r>
+      <w:r>
+        <w:rPr>
+          <w:rFonts w:ascii="Times New Roman" w:eastAsia="Times New Roman" w:hAnsi="Times New Roman" w:cs="Times New Roman"/>
+          <w:sz w:val="24"/>
+          <w:lang w:eastAsia="sv-SE"/>
+        </w:rPr>
+        <w:t xml:space="preserve"> </w:t>
       </w:r>
     </w:p>
     <w:p>
@@ -7842,42 +7978,80 @@
       <w:bookmarkStart w:id="27" w:name="figure-b_link-eco-genetic-coupling"/>
       <w:bookmarkEnd w:id="26"/>
       <w:r>
-        <w:t xml:space="preserve">Figure </w:t>
-      </w:r>
-      <w:proofErr w:type="spellStart"/>
-      <w:r>
-        <w:t>B_link</w:t>
-      </w:r>
-      <w:proofErr w:type="spellEnd"/>
+        <w:t>Figure B</w:t>
+      </w:r>
+      <w:r>
+        <w:rPr>
+          <w:vertAlign w:val="subscript"/>
+        </w:rPr>
+        <w:t>link</w:t>
+      </w:r>
       <w:r>
         <w:t xml:space="preserve"> — Eco-genetic Coupling</w:t>
       </w:r>
     </w:p>
     <w:p>
       <w:pPr>
-        <w:pStyle w:val="FirstParagraph"/>
-      </w:pPr>
-      <w:r>
-        <w:rPr>
-          <w:b/>
-          <w:bCs/>
-        </w:rPr>
-        <w:t>File:</w:t>
-      </w:r>
-      <w:r>
-        <w:t xml:space="preserve"> </w:t>
-      </w:r>
-      <w:r>
-        <w:rPr>
-          <w:rStyle w:val="VerbatimChar"/>
-        </w:rPr>
-        <w:t>mod_Blink_eco_genetic_coupling.png</w:t>
-      </w:r>
-    </w:p>
-    <w:p>
-      <w:pPr>
         <w:pStyle w:val="Brdtext"/>
       </w:pPr>
+      <w:r>
+        <w:drawing>
+          <wp:anchor distT="0" distB="0" distL="114300" distR="114300" simplePos="0" relativeHeight="251705344" behindDoc="0" locked="0" layoutInCell="1" allowOverlap="1" wp14:anchorId="13D50562" wp14:editId="049FC53B">
+            <wp:simplePos x="0" y="0"/>
+            <wp:positionH relativeFrom="column">
+              <wp:posOffset>49530</wp:posOffset>
+            </wp:positionH>
+            <wp:positionV relativeFrom="paragraph">
+              <wp:posOffset>734132</wp:posOffset>
+            </wp:positionV>
+            <wp:extent cx="2699856" cy="1800000"/>
+            <wp:effectExtent l="0" t="0" r="0" b="0"/>
+            <wp:wrapSquare wrapText="bothSides"/>
+            <wp:docPr id="1012739487" name="Bildobjekt 8"/>
+            <wp:cNvGraphicFramePr>
+              <a:graphicFrameLocks xmlns:a="http://schemas.openxmlformats.org/drawingml/2006/main" noChangeAspect="1"/>
+            </wp:cNvGraphicFramePr>
+            <a:graphic xmlns:a="http://schemas.openxmlformats.org/drawingml/2006/main">
+              <a:graphicData uri="http://schemas.openxmlformats.org/drawingml/2006/picture">
+                <pic:pic xmlns:pic="http://schemas.openxmlformats.org/drawingml/2006/picture">
+                  <pic:nvPicPr>
+                    <pic:cNvPr id="0" name="Picture 27"/>
+                    <pic:cNvPicPr>
+                      <a:picLocks noChangeAspect="1" noChangeArrowheads="1"/>
+                    </pic:cNvPicPr>
+                  </pic:nvPicPr>
+                  <pic:blipFill>
+                    <a:blip r:embed="rId13" cstate="print">
+                      <a:extLst>
+                        <a:ext uri="{28A0092B-C50C-407E-A947-70E740481C1C}">
+                          <a14:useLocalDpi xmlns:a14="http://schemas.microsoft.com/office/drawing/2010/main" val="0"/>
+                        </a:ext>
+                      </a:extLst>
+                    </a:blip>
+                    <a:srcRect/>
+                    <a:stretch>
+                      <a:fillRect/>
+                    </a:stretch>
+                  </pic:blipFill>
+                  <pic:spPr bwMode="auto">
+                    <a:xfrm>
+                      <a:off x="0" y="0"/>
+                      <a:ext cx="2699856" cy="1800000"/>
+                    </a:xfrm>
+                    <a:prstGeom prst="rect">
+                      <a:avLst/>
+                    </a:prstGeom>
+                    <a:noFill/>
+                    <a:ln>
+                      <a:noFill/>
+                    </a:ln>
+                  </pic:spPr>
+                </pic:pic>
+              </a:graphicData>
+            </a:graphic>
+          </wp:anchor>
+        </w:drawing>
+      </w:r>
       <w:r>
         <w:t xml:space="preserve">Shows </w:t>
       </w:r>
@@ -7908,10 +8082,7 @@
         </m:d>
       </m:oMath>
       <w:r>
-        <w:t xml:space="preserve"> </w:t>
-      </w:r>
-      <w:r>
-        <w:t>from the B_link model where demography and genetics are coupled. Unlike Figure B, heterozygosity here responds to population crashes. A curve that drops sharply before recovering indicates a period of demographic crisis during which drift is intense.</w:t>
+        <w:t xml:space="preserve"> from the B_link model where demography and genetics are coupled. Unlike Figure B, heterozygosity here responds to population crashes. A curve that drops sharply before recovering indicates a period of demographic crisis during which drift is intense.</w:t>
       </w:r>
     </w:p>
     <w:p>
@@ -7927,27 +8098,6 @@
     <w:p>
       <w:pPr>
         <w:pStyle w:val="FirstParagraph"/>
-      </w:pPr>
-      <w:r>
-        <w:rPr>
-          <w:b/>
-          <w:bCs/>
-        </w:rPr>
-        <w:t>File:</w:t>
-      </w:r>
-      <w:r>
-        <w:t xml:space="preserve"> </w:t>
-      </w:r>
-      <w:r>
-        <w:rPr>
-          <w:rStyle w:val="VerbatimChar"/>
-        </w:rPr>
-        <w:t>sensitivity_sigma.png</w:t>
-      </w:r>
-    </w:p>
-    <w:p>
-      <w:pPr>
-        <w:pStyle w:val="Brdtext"/>
       </w:pPr>
       <w:r>
         <w:t xml:space="preserve">Shows how </w:t>
@@ -7979,10 +8129,7 @@
         </m:d>
       </m:oMath>
       <w:r>
-        <w:t xml:space="preserve"> </w:t>
-      </w:r>
-      <w:r>
-        <w:t xml:space="preserve">varies with </w:t>
+        <w:t xml:space="preserve"> varies with </w:t>
       </w:r>
       <m:oMath>
         <m:sSub>
@@ -8013,10 +8160,62 @@
         </m:sSub>
       </m:oMath>
       <w:r>
-        <w:t xml:space="preserve"> </w:t>
-      </w:r>
-      <w:r>
-        <w:t>for each Ne/Nc ratio. Identifies the environmental-variability tolerance of each scenario.</w:t>
+        <w:t xml:space="preserve"> for each Ne/Nc ratio. Identifies the environmental-variability tolerance of each scenario.</w:t>
+      </w:r>
+    </w:p>
+    <w:p>
+      <w:pPr>
+        <w:pStyle w:val="Brdtext"/>
+      </w:pPr>
+      <w:r>
+        <w:drawing>
+          <wp:inline distT="0" distB="0" distL="0" distR="0" wp14:anchorId="6C570D3F" wp14:editId="5DF952DB">
+            <wp:extent cx="2928837" cy="854115"/>
+            <wp:effectExtent l="0" t="0" r="0" b="0"/>
+            <wp:docPr id="362930816" name="Bildobjekt 10"/>
+            <wp:cNvGraphicFramePr>
+              <a:graphicFrameLocks xmlns:a="http://schemas.openxmlformats.org/drawingml/2006/main" noChangeAspect="1"/>
+            </wp:cNvGraphicFramePr>
+            <a:graphic xmlns:a="http://schemas.openxmlformats.org/drawingml/2006/main">
+              <a:graphicData uri="http://schemas.openxmlformats.org/drawingml/2006/picture">
+                <pic:pic xmlns:pic="http://schemas.openxmlformats.org/drawingml/2006/picture">
+                  <pic:nvPicPr>
+                    <pic:cNvPr id="0" name="Picture 34"/>
+                    <pic:cNvPicPr>
+                      <a:picLocks noChangeAspect="1" noChangeArrowheads="1"/>
+                    </pic:cNvPicPr>
+                  </pic:nvPicPr>
+                  <pic:blipFill>
+                    <a:blip r:embed="rId14" cstate="print">
+                      <a:extLst>
+                        <a:ext uri="{28A0092B-C50C-407E-A947-70E740481C1C}">
+                          <a14:useLocalDpi xmlns:a14="http://schemas.microsoft.com/office/drawing/2010/main" val="0"/>
+                        </a:ext>
+                      </a:extLst>
+                    </a:blip>
+                    <a:srcRect/>
+                    <a:stretch>
+                      <a:fillRect/>
+                    </a:stretch>
+                  </pic:blipFill>
+                  <pic:spPr bwMode="auto">
+                    <a:xfrm>
+                      <a:off x="0" y="0"/>
+                      <a:ext cx="2988974" cy="871652"/>
+                    </a:xfrm>
+                    <a:prstGeom prst="rect">
+                      <a:avLst/>
+                    </a:prstGeom>
+                    <a:noFill/>
+                    <a:ln>
+                      <a:noFill/>
+                    </a:ln>
+                  </pic:spPr>
+                </pic:pic>
+              </a:graphicData>
+            </a:graphic>
+          </wp:inline>
+        </w:drawing>
       </w:r>
     </w:p>
     <w:p>
@@ -8031,31 +8230,13 @@
     </w:p>
     <w:p>
       <w:pPr>
-        <w:pStyle w:val="FirstParagraph"/>
-      </w:pPr>
-      <w:r>
-        <w:rPr>
-          <w:b/>
-          <w:bCs/>
-        </w:rPr>
-        <w:t>File:</w:t>
+        <w:pStyle w:val="Brdtext"/>
+      </w:pPr>
+      <w:r>
+        <w:t>Plots equilibrium inbreeding</w:t>
       </w:r>
       <w:r>
         <w:t xml:space="preserve"> </w:t>
-      </w:r>
-      <w:r>
-        <w:rPr>
-          <w:rStyle w:val="VerbatimChar"/>
-        </w:rPr>
-        <w:t>combined_genetic_demographic_scatter.png</w:t>
-      </w:r>
-    </w:p>
-    <w:p>
-      <w:pPr>
-        <w:pStyle w:val="Brdtext"/>
-      </w:pPr>
-      <w:r>
-        <w:t xml:space="preserve">Plots equilibrium inbreeding </w:t>
       </w:r>
       <m:oMath>
         <m:sSub>
@@ -8084,30 +8265,12 @@
             </m:r>
           </m:sub>
         </m:sSub>
-        <m:d>
-          <m:dPr>
-            <m:ctrlPr>
-              <w:rPr>
-                <w:rFonts w:ascii="Cambria Math" w:hAnsi="Cambria Math"/>
-                <w:i/>
-              </w:rPr>
-            </m:ctrlPr>
-          </m:dPr>
-          <m:e>
-            <m:r>
-              <w:rPr>
-                <w:rFonts w:ascii="Cambria Math" w:hAnsi="Cambria Math"/>
-              </w:rPr>
-              <m:t>x-axis; genetic risk</m:t>
-            </m:r>
-          </m:e>
-        </m:d>
       </m:oMath>
       <w:r>
-        <w:t xml:space="preserve"> </w:t>
-      </w:r>
-      <w:r>
-        <w:t xml:space="preserve">against </w:t>
+        <w:t xml:space="preserve"> (x-axis; genetic risk)</w:t>
+      </w:r>
+      <w:r>
+        <w:t xml:space="preserve"> against </w:t>
       </w:r>
       <m:oMath>
         <m:sSub>
@@ -8136,33 +8299,12 @@
             </m:r>
           </m:sub>
         </m:sSub>
-        <m:r>
-          <w:rPr>
-            <w:rFonts w:ascii="Cambria Math" w:hAnsi="Cambria Math"/>
-          </w:rPr>
-          <m:t xml:space="preserve">with immigration </m:t>
-        </m:r>
-        <m:d>
-          <m:dPr>
-            <m:ctrlPr>
-              <w:rPr>
-                <w:rFonts w:ascii="Cambria Math" w:hAnsi="Cambria Math"/>
-                <w:i/>
-              </w:rPr>
-            </m:ctrlPr>
-          </m:dPr>
-          <m:e>
-            <m:r>
-              <w:rPr>
-                <w:rFonts w:ascii="Cambria Math" w:hAnsi="Cambria Math"/>
-              </w:rPr>
-              <m:t>y-axis; demographic risk</m:t>
-            </m:r>
-          </m:e>
-        </m:d>
       </m:oMath>
       <w:r>
-        <w:t xml:space="preserve"> for all scenario combinations. The ideal scenario is in the lower-left quadrant. Reference lines at </w:t>
+        <w:t xml:space="preserve"> with immigration (y-axis; demographic risk) </w:t>
+      </w:r>
+      <w:r>
+        <w:t xml:space="preserve">for all scenario combinations. The ideal scenario is in the lower-left quadrant. Reference lines at </w:t>
       </w:r>
       <m:oMath>
         <m:sSub>
@@ -8199,10 +8341,7 @@
         </m:r>
       </m:oMath>
       <w:r>
-        <w:t xml:space="preserve"> </w:t>
-      </w:r>
-      <w:r>
-        <w:t>and</w:t>
+        <w:t xml:space="preserve"> and</w:t>
       </w:r>
       <m:oMath>
         <m:r>
@@ -8250,21 +8389,82 @@
     </w:p>
     <w:p>
       <w:pPr>
-        <w:pStyle w:val="Rubrik3"/>
+        <w:pStyle w:val="Brdtext"/>
+      </w:pPr>
+    </w:p>
+    <w:p>
+      <w:pPr>
+        <w:pStyle w:val="Brdtext"/>
+      </w:pPr>
+    </w:p>
+    <w:p>
+      <w:pPr>
+        <w:pStyle w:val="Underrubrik"/>
+        <w:sectPr>
+          <w:footnotePr>
+            <w:numRestart w:val="eachSect"/>
+          </w:footnotePr>
+          <w:type w:val="continuous"/>
+          <w:pgSz w:w="12240" w:h="15840"/>
+          <w:pgMar w:top="1417" w:right="1417" w:bottom="1417" w:left="1417" w:header="720" w:footer="720" w:gutter="0"/>
+          <w:cols w:num="2" w:space="720"/>
+        </w:sectPr>
       </w:pPr>
       <w:bookmarkStart w:id="30" w:name="interpreting-divergent-sub-model-outputs"/>
       <w:bookmarkEnd w:id="29"/>
-      <w:r>
-        <w:t>5.7 Interpreting Divergent Sub-model Outputs</w:t>
-      </w:r>
-    </w:p>
-    <w:p>
-      <w:pPr>
-        <w:pStyle w:val="FirstParagraph"/>
+    </w:p>
+    <w:p>
+      <w:pPr>
+        <w:pStyle w:val="Underrubrik"/>
+      </w:pPr>
+      <w:r>
+        <w:lastRenderedPageBreak/>
+        <w:t>Interpreting Divergent Sub-</w:t>
+      </w:r>
+      <w:proofErr w:type="gramStart"/>
+      <w:r>
+        <w:t>model</w:t>
+      </w:r>
+      <w:proofErr w:type="gramEnd"/>
+      <w:r>
+        <w:t xml:space="preserve"> Outputs</w:t>
+      </w:r>
+    </w:p>
+    <w:p>
+      <w:pPr>
+        <w:pStyle w:val="Brdtext"/>
       </w:pPr>
       <w:r>
         <w:t>It is common for sub-models to produce apparently contradictory results. The table below covers the most frequent patterns.</w:t>
       </w:r>
+    </w:p>
+    <w:p>
+      <w:pPr>
+        <w:pStyle w:val="Brdtext"/>
+        <w:sectPr>
+          <w:footnotePr>
+            <w:numRestart w:val="eachSect"/>
+          </w:footnotePr>
+          <w:type w:val="continuous"/>
+          <w:pgSz w:w="12240" w:h="15840"/>
+          <w:pgMar w:top="1417" w:right="1417" w:bottom="1417" w:left="1417" w:header="720" w:footer="720" w:gutter="0"/>
+          <w:cols w:space="720"/>
+        </w:sectPr>
+      </w:pPr>
+    </w:p>
+    <w:p>
+      <w:pPr>
+        <w:pStyle w:val="Brdtext"/>
+        <w:sectPr>
+          <w:footnotePr>
+            <w:numRestart w:val="eachSect"/>
+          </w:footnotePr>
+          <w:type w:val="continuous"/>
+          <w:pgSz w:w="12240" w:h="15840"/>
+          <w:pgMar w:top="1417" w:right="1417" w:bottom="1417" w:left="1417" w:header="720" w:footer="720" w:gutter="0"/>
+          <w:cols w:num="2" w:space="720"/>
+        </w:sectPr>
+      </w:pPr>
     </w:p>
     <w:tbl>
       <w:tblPr>
@@ -8285,7 +8485,7 @@
         </w:trPr>
         <w:tc>
           <w:tcPr>
-            <w:tcW w:w="1370" w:type="dxa"/>
+            <w:tcW w:w="1664" w:type="dxa"/>
           </w:tcPr>
           <w:p>
             <w:pPr>
@@ -8298,7 +8498,7 @@
         </w:tc>
         <w:tc>
           <w:tcPr>
-            <w:tcW w:w="2893" w:type="dxa"/>
+            <w:tcW w:w="3516" w:type="dxa"/>
           </w:tcPr>
           <w:p>
             <w:pPr>
@@ -8311,7 +8511,7 @@
         </w:tc>
         <w:tc>
           <w:tcPr>
-            <w:tcW w:w="3655" w:type="dxa"/>
+            <w:tcW w:w="4442" w:type="dxa"/>
           </w:tcPr>
           <w:p>
             <w:pPr>
@@ -8326,7 +8526,7 @@
       <w:tr>
         <w:tc>
           <w:tcPr>
-            <w:tcW w:w="1370" w:type="dxa"/>
+            <w:tcW w:w="1664" w:type="dxa"/>
           </w:tcPr>
           <w:p>
             <w:pPr>
@@ -8358,31 +8558,26 @@
         </w:tc>
         <w:tc>
           <w:tcPr>
-            <w:tcW w:w="2893" w:type="dxa"/>
+            <w:tcW w:w="3516" w:type="dxa"/>
           </w:tcPr>
           <w:p>
             <w:pPr>
               <w:pStyle w:val="Compact"/>
             </w:pPr>
             <w:r>
-              <w:t xml:space="preserve">Immigration maintains genetic diversity even as demographic stochasticity drives population size below Q. Genetic viability is necessary but not sufficient: without surviving individuals, gene </w:t>
-            </w:r>
-            <w:r>
-              <w:lastRenderedPageBreak/>
-              <w:t>flow cannot rescue the population.</w:t>
+              <w:t>Immigration maintains genetic diversity even as demographic stochasticity drives population size below Q. Genetic viability is necessary but not sufficient: without surviving individuals, gene flow cannot rescue the population.</w:t>
             </w:r>
           </w:p>
         </w:tc>
         <w:tc>
           <w:tcPr>
-            <w:tcW w:w="3655" w:type="dxa"/>
+            <w:tcW w:w="4442" w:type="dxa"/>
           </w:tcPr>
           <w:p>
             <w:pPr>
               <w:pStyle w:val="Compact"/>
             </w:pPr>
             <w:r>
-              <w:lastRenderedPageBreak/>
               <w:t>Priority: demographic management (habitat quality, carrying capacity). Immigration alone cannot substitute for demographic recovery.</w:t>
             </w:r>
           </w:p>
@@ -8391,7 +8586,7 @@
       <w:tr>
         <w:tc>
           <w:tcPr>
-            <w:tcW w:w="1370" w:type="dxa"/>
+            <w:tcW w:w="1664" w:type="dxa"/>
           </w:tcPr>
           <w:p>
             <w:pPr>
@@ -8408,7 +8603,7 @@
         </w:tc>
         <w:tc>
           <w:tcPr>
-            <w:tcW w:w="2893" w:type="dxa"/>
+            <w:tcW w:w="3516" w:type="dxa"/>
           </w:tcPr>
           <w:p>
             <w:pPr>
@@ -8484,14 +8679,22 @@
         </w:tc>
         <w:tc>
           <w:tcPr>
-            <w:tcW w:w="3655" w:type="dxa"/>
+            <w:tcW w:w="4442" w:type="dxa"/>
           </w:tcPr>
           <w:p>
             <w:pPr>
               <w:pStyle w:val="Compact"/>
             </w:pPr>
             <w:r>
-              <w:t>Increase Ne via genetic rescue (immigration). The Ne_target parameter defines the management threshold.</w:t>
+              <w:t xml:space="preserve">Increase Ne via genetic rescue (immigration). The </w:t>
+            </w:r>
+            <w:proofErr w:type="spellStart"/>
+            <w:r>
+              <w:t>Ne_target</w:t>
+            </w:r>
+            <w:proofErr w:type="spellEnd"/>
+            <w:r>
+              <w:t xml:space="preserve"> parameter defines the management threshold.</w:t>
             </w:r>
           </w:p>
         </w:tc>
@@ -8499,7 +8702,7 @@
       <w:tr>
         <w:tc>
           <w:tcPr>
-            <w:tcW w:w="1370" w:type="dxa"/>
+            <w:tcW w:w="1664" w:type="dxa"/>
           </w:tcPr>
           <w:p>
             <w:pPr>
@@ -8548,7 +8751,7 @@
         </w:tc>
         <w:tc>
           <w:tcPr>
-            <w:tcW w:w="2893" w:type="dxa"/>
+            <w:tcW w:w="3516" w:type="dxa"/>
           </w:tcPr>
           <w:p>
             <w:pPr>
@@ -8566,10 +8769,7 @@
               </m:r>
             </m:oMath>
             <w:r>
-              <w:t xml:space="preserve"> </w:t>
-            </w:r>
-            <w:r>
-              <w:t xml:space="preserve">and hence </w:t>
+              <w:t xml:space="preserve"> and hence </w:t>
             </w:r>
             <m:oMath>
               <m:r>
@@ -8586,14 +8786,30 @@
         </w:tc>
         <w:tc>
           <w:tcPr>
-            <w:tcW w:w="3655" w:type="dxa"/>
+            <w:tcW w:w="4442" w:type="dxa"/>
           </w:tcPr>
           <w:p>
             <w:pPr>
               <w:pStyle w:val="Compact"/>
             </w:pPr>
             <w:r>
-              <w:t>Trust B_link over B_const for conservative genetic management advice.</w:t>
+              <w:t xml:space="preserve">Trust </w:t>
+            </w:r>
+            <w:proofErr w:type="spellStart"/>
+            <w:r>
+              <w:t>B_link</w:t>
+            </w:r>
+            <w:proofErr w:type="spellEnd"/>
+            <w:r>
+              <w:t xml:space="preserve"> over </w:t>
+            </w:r>
+            <w:proofErr w:type="spellStart"/>
+            <w:r>
+              <w:t>B_const</w:t>
+            </w:r>
+            <w:proofErr w:type="spellEnd"/>
+            <w:r>
+              <w:t xml:space="preserve"> for conservative genetic management advice.</w:t>
             </w:r>
           </w:p>
         </w:tc>
@@ -8601,7 +8817,7 @@
       <w:tr>
         <w:tc>
           <w:tcPr>
-            <w:tcW w:w="1370" w:type="dxa"/>
+            <w:tcW w:w="1664" w:type="dxa"/>
           </w:tcPr>
           <w:p>
             <w:pPr>
@@ -8618,7 +8834,7 @@
         </w:tc>
         <w:tc>
           <w:tcPr>
-            <w:tcW w:w="2893" w:type="dxa"/>
+            <w:tcW w:w="3516" w:type="dxa"/>
           </w:tcPr>
           <w:p>
             <w:pPr>
@@ -8631,7 +8847,7 @@
         </w:tc>
         <w:tc>
           <w:tcPr>
-            <w:tcW w:w="3655" w:type="dxa"/>
+            <w:tcW w:w="4442" w:type="dxa"/>
           </w:tcPr>
           <w:p>
             <w:pPr>
@@ -8647,10 +8863,25 @@
     <w:p>
       <w:pPr>
         <w:pStyle w:val="Rubrik1"/>
+        <w:sectPr>
+          <w:footnotePr>
+            <w:numRestart w:val="eachSect"/>
+          </w:footnotePr>
+          <w:type w:val="continuous"/>
+          <w:pgSz w:w="12240" w:h="15840"/>
+          <w:pgMar w:top="1417" w:right="1417" w:bottom="1417" w:left="1417" w:header="720" w:footer="720" w:gutter="0"/>
+          <w:cols w:space="720"/>
+        </w:sectPr>
       </w:pPr>
       <w:bookmarkStart w:id="31" w:name="user-manual"/>
       <w:bookmarkEnd w:id="23"/>
       <w:bookmarkEnd w:id="30"/>
+    </w:p>
+    <w:p>
+      <w:pPr>
+        <w:pStyle w:val="Rubrik1"/>
+        <w:jc w:val="left"/>
+      </w:pPr>
       <w:r>
         <w:t>User Manual</w:t>
       </w:r>
@@ -8658,6 +8889,7 @@
     <w:p>
       <w:pPr>
         <w:pStyle w:val="Underrubrik"/>
+        <w:jc w:val="left"/>
       </w:pPr>
       <w:bookmarkStart w:id="32" w:name="requirements"/>
       <w:r>
@@ -8671,12 +8903,28 @@
       <w:r>
         <w:t xml:space="preserve">Python 3.9+ with: </w:t>
       </w:r>
+      <w:proofErr w:type="spellStart"/>
       <w:r>
         <w:rPr>
           <w:rStyle w:val="VerbatimChar"/>
         </w:rPr>
-        <w:t>numpy pandas matplotlib openpyxl</w:t>
-      </w:r>
+        <w:t>numpy</w:t>
+      </w:r>
+      <w:proofErr w:type="spellEnd"/>
+      <w:r>
+        <w:rPr>
+          <w:rStyle w:val="VerbatimChar"/>
+        </w:rPr>
+        <w:t xml:space="preserve"> pandas matplotlib </w:t>
+      </w:r>
+      <w:proofErr w:type="spellStart"/>
+      <w:r>
+        <w:rPr>
+          <w:rStyle w:val="VerbatimChar"/>
+        </w:rPr>
+        <w:t>openpyxl</w:t>
+      </w:r>
+      <w:proofErr w:type="spellEnd"/>
     </w:p>
     <w:p>
       <w:pPr>
@@ -8692,8 +8940,30 @@
         <w:rPr>
           <w:rStyle w:val="NormalTok"/>
         </w:rPr>
-        <w:t xml:space="preserve"> install numpy pandas matplotlib openpyxl</w:t>
-      </w:r>
+        <w:t xml:space="preserve"> install </w:t>
+      </w:r>
+      <w:proofErr w:type="spellStart"/>
+      <w:r>
+        <w:rPr>
+          <w:rStyle w:val="NormalTok"/>
+        </w:rPr>
+        <w:t>numpy</w:t>
+      </w:r>
+      <w:proofErr w:type="spellEnd"/>
+      <w:r>
+        <w:rPr>
+          <w:rStyle w:val="NormalTok"/>
+        </w:rPr>
+        <w:t xml:space="preserve"> pandas matplotlib </w:t>
+      </w:r>
+      <w:proofErr w:type="spellStart"/>
+      <w:r>
+        <w:rPr>
+          <w:rStyle w:val="NormalTok"/>
+        </w:rPr>
+        <w:t>openpyxl</w:t>
+      </w:r>
+      <w:proofErr w:type="spellEnd"/>
     </w:p>
     <w:p>
       <w:pPr>
@@ -8722,17 +8992,16 @@
         <w:rPr>
           <w:rStyle w:val="VerbatimChar"/>
         </w:rPr>
-        <w:t>config_verbascum.py         Species config — Verbascum lychnitis</w:t>
-      </w:r>
-      <w:r>
-        <w:br/>
-      </w:r>
+        <w:t xml:space="preserve">config_verbascum.py         Species config — Verbascum </w:t>
+      </w:r>
+      <w:proofErr w:type="spellStart"/>
       <w:r>
         <w:rPr>
           <w:rStyle w:val="VerbatimChar"/>
         </w:rPr>
-        <w:t>config_bufo.py              Species config — Bufo bufo</w:t>
-      </w:r>
+        <w:t>lychnitis</w:t>
+      </w:r>
+      <w:proofErr w:type="spellEnd"/>
       <w:r>
         <w:br/>
       </w:r>
@@ -8740,7 +9009,38 @@
         <w:rPr>
           <w:rStyle w:val="VerbatimChar"/>
         </w:rPr>
-        <w:t>config_lissotriton.py       Species config — Lissotriton vulgaris</w:t>
+        <w:t xml:space="preserve">config_bufo.py              Species config — Bufo </w:t>
+      </w:r>
+      <w:proofErr w:type="spellStart"/>
+      <w:r>
+        <w:rPr>
+          <w:rStyle w:val="VerbatimChar"/>
+        </w:rPr>
+        <w:t>bufo</w:t>
+      </w:r>
+      <w:proofErr w:type="spellEnd"/>
+      <w:r>
+        <w:br/>
+      </w:r>
+      <w:r>
+        <w:rPr>
+          <w:rStyle w:val="VerbatimChar"/>
+        </w:rPr>
+        <w:t xml:space="preserve">config_lissotriton.py       Species config — </w:t>
+      </w:r>
+      <w:proofErr w:type="spellStart"/>
+      <w:r>
+        <w:rPr>
+          <w:rStyle w:val="VerbatimChar"/>
+        </w:rPr>
+        <w:t>Lissotriton</w:t>
+      </w:r>
+      <w:proofErr w:type="spellEnd"/>
+      <w:r>
+        <w:rPr>
+          <w:rStyle w:val="VerbatimChar"/>
+        </w:rPr>
+        <w:t xml:space="preserve"> vulgaris</w:t>
       </w:r>
       <w:r>
         <w:br/>
@@ -8755,10 +9055,24 @@
     <w:p>
       <w:pPr>
         <w:pStyle w:val="Underrubrik"/>
+        <w:jc w:val="left"/>
       </w:pPr>
       <w:bookmarkStart w:id="34" w:name="quick-start"/>
       <w:bookmarkEnd w:id="33"/>
-      <w:r>
+    </w:p>
+    <w:p>
+      <w:pPr>
+        <w:pStyle w:val="Underrubrik"/>
+        <w:jc w:val="left"/>
+      </w:pPr>
+    </w:p>
+    <w:p>
+      <w:pPr>
+        <w:pStyle w:val="Underrubrik"/>
+        <w:jc w:val="left"/>
+      </w:pPr>
+      <w:r>
+        <w:lastRenderedPageBreak/>
         <w:t>Quick Start</w:t>
       </w:r>
     </w:p>
@@ -8771,7 +9085,6 @@
         </w:numPr>
       </w:pPr>
       <w:r>
-        <w:lastRenderedPageBreak/>
         <w:t xml:space="preserve">Open </w:t>
       </w:r>
       <w:r>
@@ -8908,6 +9221,10 @@
           <w:ilvl w:val="0"/>
           <w:numId w:val="3"/>
         </w:numPr>
+        <w:rPr>
+          <w:rStyle w:val="VerbatimChar"/>
+          <w:rFonts w:asciiTheme="minorHAnsi" w:hAnsiTheme="minorHAnsi"/>
+        </w:rPr>
       </w:pPr>
       <w:r>
         <w:t xml:space="preserve">Results in </w:t>
@@ -8918,6 +9235,11 @@
         </w:rPr>
         <w:t>RESULTS/&lt;PROJECT_NAME&gt;_&lt;SPECIES&gt;_&lt;timestamp&gt;/</w:t>
       </w:r>
+    </w:p>
+    <w:p>
+      <w:pPr>
+        <w:pStyle w:val="Compact"/>
+      </w:pPr>
     </w:p>
     <w:p>
       <w:pPr>
@@ -9056,7 +9378,15 @@
               <w:pStyle w:val="Compact"/>
             </w:pPr>
             <w:r>
-              <w:t>Local breeding census (genetics B, B_link); usually = K</w:t>
+              <w:t xml:space="preserve">Local breeding census (genetics B, </w:t>
+            </w:r>
+            <w:proofErr w:type="spellStart"/>
+            <w:r>
+              <w:t>B_link</w:t>
+            </w:r>
+            <w:proofErr w:type="spellEnd"/>
+            <w:r>
+              <w:t>); usually = K</w:t>
             </w:r>
           </w:p>
         </w:tc>
@@ -9208,8 +9538,17 @@
                 <w:i/>
                 <w:iCs/>
               </w:rPr>
-              <w:t>V. lychnitis</w:t>
-            </w:r>
+              <w:t xml:space="preserve">V. </w:t>
+            </w:r>
+            <w:proofErr w:type="spellStart"/>
+            <w:r>
+              <w:rPr>
+                <w:i/>
+                <w:iCs/>
+              </w:rPr>
+              <w:t>lychnitis</w:t>
+            </w:r>
+            <w:proofErr w:type="spellEnd"/>
           </w:p>
         </w:tc>
       </w:tr>
@@ -9459,7 +9798,15 @@
               <w:pStyle w:val="Compact"/>
             </w:pPr>
             <w:r>
-              <w:t>Ne below which σ_eff inflates</w:t>
+              <w:t xml:space="preserve">Ne below which </w:t>
+            </w:r>
+            <w:proofErr w:type="spellStart"/>
+            <w:r>
+              <w:t>σ_eff</w:t>
+            </w:r>
+            <w:proofErr w:type="spellEnd"/>
+            <w:r>
+              <w:t xml:space="preserve"> inflates</w:t>
             </w:r>
           </w:p>
         </w:tc>
@@ -9503,11 +9850,7 @@
               <w:pStyle w:val="Compact"/>
             </w:pPr>
             <w:r>
-              <w:t xml:space="preserve">Curvature of Ne–stochasticity </w:t>
-            </w:r>
-            <w:r>
-              <w:lastRenderedPageBreak/>
-              <w:t>penalty</w:t>
+              <w:t>Curvature of Ne–stochasticity penalty</w:t>
             </w:r>
           </w:p>
         </w:tc>
@@ -9520,7 +9863,6 @@
               <w:pStyle w:val="Compact"/>
             </w:pPr>
             <w:r>
-              <w:lastRenderedPageBreak/>
               <w:t>0.5–1.0</w:t>
             </w:r>
           </w:p>
@@ -9755,7 +10097,21 @@
               <w:rPr>
                 <w:rStyle w:val="VerbatimChar"/>
               </w:rPr>
-              <w:t>"annual_seedbank"</w:t>
+              <w:t>"</w:t>
+            </w:r>
+            <w:proofErr w:type="spellStart"/>
+            <w:r>
+              <w:rPr>
+                <w:rStyle w:val="VerbatimChar"/>
+              </w:rPr>
+              <w:t>annual_seedbank</w:t>
+            </w:r>
+            <w:proofErr w:type="spellEnd"/>
+            <w:r>
+              <w:rPr>
+                <w:rStyle w:val="VerbatimChar"/>
+              </w:rPr>
+              <w:t>"</w:t>
             </w:r>
             <w:r>
               <w:t xml:space="preserve">, </w:t>
@@ -9795,7 +10151,14 @@
               <w:rPr>
                 <w:rStyle w:val="VerbatimChar"/>
               </w:rPr>
-              <w:t>S_PREREPRODUCTIVE_MORTALITY</w:t>
+              <w:t>S_PREREPRODUCTIVE_MO</w:t>
+            </w:r>
+            <w:r>
+              <w:rPr>
+                <w:rStyle w:val="VerbatimChar"/>
+              </w:rPr>
+              <w:lastRenderedPageBreak/>
+              <w:t>RTALITY</w:t>
             </w:r>
           </w:p>
         </w:tc>
@@ -9808,7 +10171,12 @@
               <w:pStyle w:val="Compact"/>
             </w:pPr>
             <w:r>
-              <w:t>Fraction dying before first reproduction (monocarpic)</w:t>
+              <w:lastRenderedPageBreak/>
+              <w:t>Fraction dying before first re</w:t>
+            </w:r>
+            <w:r>
+              <w:lastRenderedPageBreak/>
+              <w:t>production (monocarpic)</w:t>
             </w:r>
           </w:p>
         </w:tc>
@@ -9821,6 +10189,7 @@
               <w:pStyle w:val="Compact"/>
             </w:pPr>
             <w:r>
+              <w:lastRenderedPageBreak/>
               <w:t>0.0–0.2</w:t>
             </w:r>
           </w:p>
@@ -9850,24 +10219,17 @@
           <w:p>
             <w:pPr>
               <w:pStyle w:val="Compact"/>
-              <w:rPr>
-                <w:lang w:val="es-ES"/>
-              </w:rPr>
             </w:pPr>
             <w:r>
-              <w:rPr>
-                <w:lang w:val="es-ES"/>
-              </w:rPr>
               <w:t xml:space="preserve">Initial </w:t>
             </w:r>
-            <w:r>
-              <w:t>σ</w:t>
-            </w:r>
-            <w:r>
-              <w:rPr>
-                <w:lang w:val="es-ES"/>
-              </w:rPr>
-              <w:t>_e multiplier (1.0 = no disturbance)</w:t>
+            <w:proofErr w:type="spellStart"/>
+            <w:r>
+              <w:t>σ_e</w:t>
+            </w:r>
+            <w:proofErr w:type="spellEnd"/>
+            <w:r>
+              <w:t xml:space="preserve"> multiplier (1.0 = no disturbance)</w:t>
             </w:r>
           </w:p>
         </w:tc>
@@ -9998,8 +10360,21 @@
             <w:pPr>
               <w:pStyle w:val="Compact"/>
             </w:pPr>
-            <w:r>
-              <w:t>Dict: weights for A, B_link, C (must sum to 1)</w:t>
+            <w:proofErr w:type="spellStart"/>
+            <w:r>
+              <w:t>Dict</w:t>
+            </w:r>
+            <w:proofErr w:type="spellEnd"/>
+            <w:r>
+              <w:t xml:space="preserve">: weights for A, </w:t>
+            </w:r>
+            <w:proofErr w:type="spellStart"/>
+            <w:r>
+              <w:t>B_link</w:t>
+            </w:r>
+            <w:proofErr w:type="spellEnd"/>
+            <w:r>
+              <w:t>, C (must sum to 1)</w:t>
             </w:r>
           </w:p>
         </w:tc>
@@ -10024,6 +10399,12 @@
       </w:pPr>
       <w:bookmarkStart w:id="36" w:name="species-specific-guidance"/>
       <w:bookmarkEnd w:id="35"/>
+    </w:p>
+    <w:p>
+      <w:pPr>
+        <w:pStyle w:val="Underrubrik"/>
+        <w:jc w:val="left"/>
+      </w:pPr>
       <w:r>
         <w:t>Species-specific Guidance</w:t>
       </w:r>
@@ -10031,13 +10412,40 @@
     <w:p>
       <w:pPr>
         <w:pStyle w:val="Rubrik4"/>
+        <w:rPr>
+          <w:i w:val="0"/>
+          <w:iCs w:val="0"/>
+          <w:color w:val="auto"/>
+        </w:rPr>
       </w:pPr>
       <w:bookmarkStart w:id="37" w:name="verbascum-lychnitis-monocarpic-perennial"/>
       <w:r>
-        <w:t>Verbascum lychnitis</w:t>
-      </w:r>
-      <w:r>
-        <w:t xml:space="preserve"> (monocarpic perennial)</w:t>
+        <w:rPr>
+          <w:color w:val="auto"/>
+        </w:rPr>
+        <w:t xml:space="preserve">Verbascum </w:t>
+      </w:r>
+      <w:proofErr w:type="spellStart"/>
+      <w:r>
+        <w:rPr>
+          <w:color w:val="auto"/>
+        </w:rPr>
+        <w:t>lychnitis</w:t>
+      </w:r>
+      <w:proofErr w:type="spellEnd"/>
+      <w:r>
+        <w:rPr>
+          <w:color w:val="auto"/>
+        </w:rPr>
+        <w:t xml:space="preserve"> </w:t>
+      </w:r>
+      <w:r>
+        <w:rPr>
+          <w:i w:val="0"/>
+          <w:iCs w:val="0"/>
+          <w:color w:val="auto"/>
+        </w:rPr>
+        <w:t>(monocarpic perennial)</w:t>
       </w:r>
     </w:p>
     <w:p>
@@ -10124,14 +10532,10 @@
         </w:numPr>
       </w:pPr>
       <w:r>
-        <w:t xml:space="preserve">Vitalis multiplier at T = 4, s = 0.05: </w:t>
-      </w:r>
-      <w:r>
-        <w:rPr>
-          <w:b/>
-          <w:bCs/>
-        </w:rPr>
-        <w:t>≈ 3.9× generational Ne inflation</w:t>
+        <w:t xml:space="preserve">Vitalis multiplier at T = 4, s </w:t>
+      </w:r>
+      <w:r>
+        <w:t>= 0.05: ≈ 3.9× generational Ne inflation</w:t>
       </w:r>
     </w:p>
     <w:p>
@@ -10141,6 +10545,10 @@
           <w:ilvl w:val="0"/>
           <w:numId w:val="4"/>
         </w:numPr>
+        <w:rPr>
+          <w:rStyle w:val="VerbatimChar"/>
+          <w:rFonts w:asciiTheme="minorHAnsi" w:hAnsiTheme="minorHAnsi"/>
+        </w:rPr>
       </w:pPr>
       <w:r>
         <w:rPr>
@@ -10160,21 +10568,60 @@
     </w:p>
     <w:p>
       <w:pPr>
+        <w:pStyle w:val="Compact"/>
+        <w:ind w:left="720"/>
+      </w:pPr>
+    </w:p>
+    <w:p>
+      <w:pPr>
         <w:pStyle w:val="Rubrik4"/>
+        <w:rPr>
+          <w:color w:val="auto"/>
+        </w:rPr>
       </w:pPr>
       <w:bookmarkStart w:id="38" w:name="X3f7f8bbe31338cef4ee5136e3706fb27d3c4a4f"/>
       <w:bookmarkEnd w:id="37"/>
       <w:r>
-        <w:t>Bufo bufo</w:t>
-      </w:r>
-      <w:r>
+        <w:rPr>
+          <w:color w:val="auto"/>
+        </w:rPr>
+        <w:t xml:space="preserve">Bufo </w:t>
+      </w:r>
+      <w:proofErr w:type="spellStart"/>
+      <w:r>
+        <w:rPr>
+          <w:color w:val="auto"/>
+        </w:rPr>
+        <w:t>bufo</w:t>
+      </w:r>
+      <w:proofErr w:type="spellEnd"/>
+      <w:r>
+        <w:rPr>
+          <w:color w:val="auto"/>
+        </w:rPr>
         <w:t xml:space="preserve"> / </w:t>
       </w:r>
-      <w:r>
-        <w:t>Lissotriton vulgaris</w:t>
-      </w:r>
-      <w:r>
-        <w:t xml:space="preserve"> (iteroparous amphibians)</w:t>
+      <w:proofErr w:type="spellStart"/>
+      <w:r>
+        <w:rPr>
+          <w:color w:val="auto"/>
+        </w:rPr>
+        <w:t>Lissotriton</w:t>
+      </w:r>
+      <w:proofErr w:type="spellEnd"/>
+      <w:r>
+        <w:rPr>
+          <w:color w:val="auto"/>
+        </w:rPr>
+        <w:t xml:space="preserve"> vulgaris </w:t>
+      </w:r>
+      <w:r>
+        <w:rPr>
+          <w:i w:val="0"/>
+          <w:iCs w:val="0"/>
+          <w:color w:val="auto"/>
+        </w:rPr>
+        <w:t>(iteroparous amphibians)</w:t>
       </w:r>
     </w:p>
     <w:p>
@@ -10204,7 +10651,6 @@
         <w:rPr>
           <w:rStyle w:val="VerbatimChar"/>
         </w:rPr>
-        <w:lastRenderedPageBreak/>
         <w:t>S_PREREPRODUCTIVE_MORTALITY = 0.0</w:t>
       </w:r>
     </w:p>
@@ -10276,8 +10722,13 @@
           <w:numId w:val="6"/>
         </w:numPr>
       </w:pPr>
-      <w:r>
-        <w:t xml:space="preserve">Beissinger, S.R. &amp; Westphal, M.I. (1998). On the use of demographic models of population viability in endangered species management. </w:t>
+      <w:proofErr w:type="spellStart"/>
+      <w:r>
+        <w:t>Beissinger</w:t>
+      </w:r>
+      <w:proofErr w:type="spellEnd"/>
+      <w:r>
+        <w:t xml:space="preserve">, S.R. &amp; Westphal, M.I. (1998). On the use of demographic models of population viability in endangered species management. </w:t>
       </w:r>
       <w:r>
         <w:rPr>
@@ -10320,47 +10771,8 @@
           <w:numId w:val="6"/>
         </w:numPr>
       </w:pPr>
-      <w:proofErr w:type="spellStart"/>
-      <w:r>
-        <w:rPr>
-          <w:lang w:val="sv-SE"/>
-        </w:rPr>
-        <w:t>Lande</w:t>
-      </w:r>
-      <w:proofErr w:type="spellEnd"/>
-      <w:r>
-        <w:rPr>
-          <w:lang w:val="sv-SE"/>
-        </w:rPr>
-        <w:t xml:space="preserve">, R., </w:t>
-      </w:r>
-      <w:proofErr w:type="spellStart"/>
-      <w:r>
-        <w:rPr>
-          <w:lang w:val="sv-SE"/>
-        </w:rPr>
-        <w:t>Engen</w:t>
-      </w:r>
-      <w:proofErr w:type="spellEnd"/>
-      <w:r>
-        <w:rPr>
-          <w:lang w:val="sv-SE"/>
-        </w:rPr>
-        <w:t xml:space="preserve">, S. &amp; </w:t>
-      </w:r>
-      <w:proofErr w:type="spellStart"/>
-      <w:r>
-        <w:rPr>
-          <w:lang w:val="sv-SE"/>
-        </w:rPr>
-        <w:t>Sæther</w:t>
-      </w:r>
-      <w:proofErr w:type="spellEnd"/>
-      <w:r>
-        <w:rPr>
-          <w:lang w:val="sv-SE"/>
-        </w:rPr>
-        <w:t xml:space="preserve">, B.-E. (2003). </w:t>
+      <w:r>
+        <w:t xml:space="preserve">Lande, R., Engen, S. &amp; Sæther, B.-E. (2003). </w:t>
       </w:r>
       <w:r>
         <w:rPr>
@@ -10426,7 +10838,24 @@
         </w:numPr>
       </w:pPr>
       <w:r>
-        <w:t xml:space="preserve">Vitalis, R., Glemin, S. &amp; Olivieri, I. (2004). When genes go to sleep: the population genetic consequences of seed dormancy and monocarpic perenniality. </w:t>
+        <w:lastRenderedPageBreak/>
+        <w:t xml:space="preserve">Vitalis, R., </w:t>
+      </w:r>
+      <w:proofErr w:type="spellStart"/>
+      <w:r>
+        <w:t>Glemin</w:t>
+      </w:r>
+      <w:proofErr w:type="spellEnd"/>
+      <w:r>
+        <w:t xml:space="preserve">, S. &amp; Olivieri, I. (2004). When genes go to sleep: the population genetic consequences of seed dormancy and monocarpic </w:t>
+      </w:r>
+      <w:proofErr w:type="spellStart"/>
+      <w:r>
+        <w:t>perenniality</w:t>
+      </w:r>
+      <w:proofErr w:type="spellEnd"/>
+      <w:r>
+        <w:t xml:space="preserve">. </w:t>
       </w:r>
       <w:r>
         <w:rPr>
@@ -10467,12 +10896,255 @@
       <w:footnotePr>
         <w:numRestart w:val="eachSect"/>
       </w:footnotePr>
+      <w:type w:val="continuous"/>
       <w:pgSz w:w="12240" w:h="15840"/>
       <w:pgMar w:top="1417" w:right="1417" w:bottom="1417" w:left="1417" w:header="720" w:footer="720" w:gutter="0"/>
       <w:cols w:space="720"/>
     </w:sectPr>
   </w:body>
 </w:document>
+</file>
+
+<file path=word/endnotes.xml><?xml version="1.0" encoding="utf-8"?>
+<w:endnotes xmlns:wpc="http://schemas.microsoft.com/office/word/2010/wordprocessingCanvas" xmlns:cx="http://schemas.microsoft.com/office/drawing/2014/chartex" xmlns:cx1="http://schemas.microsoft.com/office/drawing/2015/9/8/chartex" xmlns:cx2="http://schemas.microsoft.com/office/drawing/2015/10/21/chartex" xmlns:cx3="http://schemas.microsoft.com/office/drawing/2016/5/9/chartex" xmlns:cx4="http://schemas.microsoft.com/office/drawing/2016/5/10/chartex" xmlns:cx5="http://schemas.microsoft.com/office/drawing/2016/5/11/chartex" xmlns:cx6="http://schemas.microsoft.com/office/drawing/2016/5/12/chartex" xmlns:cx7="http://schemas.microsoft.com/office/drawing/2016/5/13/chartex" xmlns:cx8="http://schemas.microsoft.com/office/drawing/2016/5/14/chartex" xmlns:mc="http://schemas.openxmlformats.org/markup-compatibility/2006" xmlns:aink="http://schemas.microsoft.com/office/drawing/2016/ink" xmlns:am3d="http://schemas.microsoft.com/office/drawing/2017/model3d" xmlns:o="urn:schemas-microsoft-com:office:office" xmlns:oel="http://schemas.microsoft.com/office/2019/extlst" xmlns:r="http://schemas.openxmlformats.org/officeDocument/2006/relationships" xmlns:m="http://schemas.openxmlformats.org/officeDocument/2006/math" xmlns:v="urn:schemas-microsoft-com:vml" xmlns:wp14="http://schemas.microsoft.com/office/word/2010/wordprocessingDrawing" xmlns:wp="http://schemas.openxmlformats.org/drawingml/2006/wordprocessingDrawing" xmlns:w10="urn:schemas-microsoft-com:office:word" xmlns:w="http://schemas.openxmlformats.org/wordprocessingml/2006/main" xmlns:w14="http://schemas.microsoft.com/office/word/2010/wordml" xmlns:w15="http://schemas.microsoft.com/office/word/2012/wordml" xmlns:w16cex="http://schemas.microsoft.com/office/word/2018/wordml/cex" xmlns:w16cid="http://schemas.microsoft.com/office/word/2016/wordml/cid" xmlns:w16="http://schemas.microsoft.com/office/word/2018/wordml" xmlns:w16du="http://schemas.microsoft.com/office/word/2023/wordml/word16du" xmlns:w16sdtdh="http://schemas.microsoft.com/office/word/2020/wordml/sdtdatahash" xmlns:w16sdtfl="http://schemas.microsoft.com/office/word/2024/wordml/sdtformatlock" xmlns:w16se="http://schemas.microsoft.com/office/word/2015/wordml/symex" xmlns:wpg="http://schemas.microsoft.com/office/word/2010/wordprocessingGroup" xmlns:wpi="http://schemas.microsoft.com/office/word/2010/wordprocessingInk" xmlns:wne="http://schemas.microsoft.com/office/word/2006/wordml" xmlns:wps="http://schemas.microsoft.com/office/word/2010/wordprocessingShape" mc:Ignorable="w14 w15 w16se w16cid w16 w16cex w16sdtdh w16sdtfl w16du wp14">
+  <w:endnote w:type="separator" w:id="-1">
+    <w:p>
+      <w:pPr>
+        <w:spacing w:after="0"/>
+      </w:pPr>
+      <w:r>
+        <w:separator/>
+      </w:r>
+    </w:p>
+  </w:endnote>
+  <w:endnote w:type="continuationSeparator" w:id="0">
+    <w:p>
+      <w:pPr>
+        <w:spacing w:after="0"/>
+      </w:pPr>
+      <w:r>
+        <w:continuationSeparator/>
+      </w:r>
+    </w:p>
+  </w:endnote>
+</w:endnotes>
+</file>
+
+<file path=word/footer1.xml><?xml version="1.0" encoding="utf-8"?>
+<w:ftr xmlns:wpc="http://schemas.microsoft.com/office/word/2010/wordprocessingCanvas" xmlns:cx="http://schemas.microsoft.com/office/drawing/2014/chartex" xmlns:cx1="http://schemas.microsoft.com/office/drawing/2015/9/8/chartex" xmlns:cx2="http://schemas.microsoft.com/office/drawing/2015/10/21/chartex" xmlns:cx3="http://schemas.microsoft.com/office/drawing/2016/5/9/chartex" xmlns:cx4="http://schemas.microsoft.com/office/drawing/2016/5/10/chartex" xmlns:cx5="http://schemas.microsoft.com/office/drawing/2016/5/11/chartex" xmlns:cx6="http://schemas.microsoft.com/office/drawing/2016/5/12/chartex" xmlns:cx7="http://schemas.microsoft.com/office/drawing/2016/5/13/chartex" xmlns:cx8="http://schemas.microsoft.com/office/drawing/2016/5/14/chartex" xmlns:mc="http://schemas.openxmlformats.org/markup-compatibility/2006" xmlns:aink="http://schemas.microsoft.com/office/drawing/2016/ink" xmlns:am3d="http://schemas.microsoft.com/office/drawing/2017/model3d" xmlns:o="urn:schemas-microsoft-com:office:office" xmlns:oel="http://schemas.microsoft.com/office/2019/extlst" xmlns:r="http://schemas.openxmlformats.org/officeDocument/2006/relationships" xmlns:m="http://schemas.openxmlformats.org/officeDocument/2006/math" xmlns:v="urn:schemas-microsoft-com:vml" xmlns:wp14="http://schemas.microsoft.com/office/word/2010/wordprocessingDrawing" xmlns:wp="http://schemas.openxmlformats.org/drawingml/2006/wordprocessingDrawing" xmlns:w10="urn:schemas-microsoft-com:office:word" xmlns:w="http://schemas.openxmlformats.org/wordprocessingml/2006/main" xmlns:w14="http://schemas.microsoft.com/office/word/2010/wordml" xmlns:w15="http://schemas.microsoft.com/office/word/2012/wordml" xmlns:w16cex="http://schemas.microsoft.com/office/word/2018/wordml/cex" xmlns:w16cid="http://schemas.microsoft.com/office/word/2016/wordml/cid" xmlns:w16="http://schemas.microsoft.com/office/word/2018/wordml" xmlns:w16du="http://schemas.microsoft.com/office/word/2023/wordml/word16du" xmlns:w16sdtdh="http://schemas.microsoft.com/office/word/2020/wordml/sdtdatahash" xmlns:w16sdtfl="http://schemas.microsoft.com/office/word/2024/wordml/sdtformatlock" xmlns:w16se="http://schemas.microsoft.com/office/word/2015/wordml/symex" xmlns:wpg="http://schemas.microsoft.com/office/word/2010/wordprocessingGroup" xmlns:wpi="http://schemas.microsoft.com/office/word/2010/wordprocessingInk" xmlns:wne="http://schemas.microsoft.com/office/word/2006/wordml" xmlns:wps="http://schemas.microsoft.com/office/word/2010/wordprocessingShape" mc:Ignorable="w14 w15 w16se w16cid w16 w16cex w16sdtdh w16sdtfl w16du wp14">
+  <w:sdt>
+    <w:sdtPr>
+      <w:rPr>
+        <w:sz w:val="20"/>
+        <w:szCs w:val="20"/>
+      </w:rPr>
+      <w:id w:val="996530406"/>
+      <w:docPartObj>
+        <w:docPartGallery w:val="Page Numbers (Bottom of Page)"/>
+        <w:docPartUnique/>
+      </w:docPartObj>
+    </w:sdtPr>
+    <w:sdtContent>
+      <w:p>
+        <w:pPr>
+          <w:pStyle w:val="Sidfot"/>
+          <w:jc w:val="right"/>
+          <w:rPr>
+            <w:sz w:val="20"/>
+            <w:szCs w:val="20"/>
+          </w:rPr>
+        </w:pPr>
+        <w:r>
+          <w:rPr>
+            <w:sz w:val="20"/>
+            <w:szCs w:val="20"/>
+          </w:rPr>
+          <w:fldChar w:fldCharType="begin"/>
+        </w:r>
+        <w:r>
+          <w:rPr>
+            <w:sz w:val="20"/>
+            <w:szCs w:val="20"/>
+          </w:rPr>
+          <w:instrText>PAGE   \* MERGEFORMAT</w:instrText>
+        </w:r>
+        <w:r>
+          <w:rPr>
+            <w:sz w:val="20"/>
+            <w:szCs w:val="20"/>
+          </w:rPr>
+          <w:fldChar w:fldCharType="separate"/>
+        </w:r>
+        <w:r>
+          <w:rPr>
+            <w:sz w:val="20"/>
+            <w:szCs w:val="20"/>
+          </w:rPr>
+          <w:t>2</w:t>
+        </w:r>
+        <w:r>
+          <w:rPr>
+            <w:sz w:val="20"/>
+            <w:szCs w:val="20"/>
+          </w:rPr>
+          <w:fldChar w:fldCharType="end"/>
+        </w:r>
+      </w:p>
+    </w:sdtContent>
+  </w:sdt>
+  <w:p>
+    <w:pPr>
+      <w:pStyle w:val="Sidfot"/>
+      <w:rPr>
+        <w:sz w:val="20"/>
+        <w:szCs w:val="20"/>
+      </w:rPr>
+    </w:pPr>
+  </w:p>
+</w:ftr>
+</file>
+
+<file path=word/footer2.xml><?xml version="1.0" encoding="utf-8"?>
+<w:ftr xmlns:wpc="http://schemas.microsoft.com/office/word/2010/wordprocessingCanvas" xmlns:cx="http://schemas.microsoft.com/office/drawing/2014/chartex" xmlns:cx1="http://schemas.microsoft.com/office/drawing/2015/9/8/chartex" xmlns:cx2="http://schemas.microsoft.com/office/drawing/2015/10/21/chartex" xmlns:cx3="http://schemas.microsoft.com/office/drawing/2016/5/9/chartex" xmlns:cx4="http://schemas.microsoft.com/office/drawing/2016/5/10/chartex" xmlns:cx5="http://schemas.microsoft.com/office/drawing/2016/5/11/chartex" xmlns:cx6="http://schemas.microsoft.com/office/drawing/2016/5/12/chartex" xmlns:cx7="http://schemas.microsoft.com/office/drawing/2016/5/13/chartex" xmlns:cx8="http://schemas.microsoft.com/office/drawing/2016/5/14/chartex" xmlns:mc="http://schemas.openxmlformats.org/markup-compatibility/2006" xmlns:aink="http://schemas.microsoft.com/office/drawing/2016/ink" xmlns:am3d="http://schemas.microsoft.com/office/drawing/2017/model3d" xmlns:o="urn:schemas-microsoft-com:office:office" xmlns:oel="http://schemas.microsoft.com/office/2019/extlst" xmlns:r="http://schemas.openxmlformats.org/officeDocument/2006/relationships" xmlns:m="http://schemas.openxmlformats.org/officeDocument/2006/math" xmlns:v="urn:schemas-microsoft-com:vml" xmlns:wp14="http://schemas.microsoft.com/office/word/2010/wordprocessingDrawing" xmlns:wp="http://schemas.openxmlformats.org/drawingml/2006/wordprocessingDrawing" xmlns:w10="urn:schemas-microsoft-com:office:word" xmlns:w="http://schemas.openxmlformats.org/wordprocessingml/2006/main" xmlns:w14="http://schemas.microsoft.com/office/word/2010/wordml" xmlns:w15="http://schemas.microsoft.com/office/word/2012/wordml" xmlns:w16cex="http://schemas.microsoft.com/office/word/2018/wordml/cex" xmlns:w16cid="http://schemas.microsoft.com/office/word/2016/wordml/cid" xmlns:w16="http://schemas.microsoft.com/office/word/2018/wordml" xmlns:w16du="http://schemas.microsoft.com/office/word/2023/wordml/word16du" xmlns:w16sdtdh="http://schemas.microsoft.com/office/word/2020/wordml/sdtdatahash" xmlns:w16sdtfl="http://schemas.microsoft.com/office/word/2024/wordml/sdtformatlock" xmlns:w16se="http://schemas.microsoft.com/office/word/2015/wordml/symex" xmlns:wpg="http://schemas.microsoft.com/office/word/2010/wordprocessingGroup" xmlns:wpi="http://schemas.microsoft.com/office/word/2010/wordprocessingInk" xmlns:wne="http://schemas.microsoft.com/office/word/2006/wordml" xmlns:wps="http://schemas.microsoft.com/office/word/2010/wordprocessingShape" mc:Ignorable="w14 w15 w16se w16cid w16 w16cex w16sdtdh w16sdtfl w16du wp14">
+  <w:p>
+    <w:pPr>
+      <w:pStyle w:val="Brdtext"/>
+      <w:jc w:val="left"/>
+    </w:pPr>
+    <w:r>
+      <w:drawing>
+        <wp:anchor distT="0" distB="0" distL="114300" distR="114300" simplePos="0" relativeHeight="251667968" behindDoc="0" locked="0" layoutInCell="1" allowOverlap="1" wp14:anchorId="650A89EF" wp14:editId="605A7A74">
+          <wp:simplePos x="0" y="0"/>
+          <wp:positionH relativeFrom="column">
+            <wp:posOffset>14633</wp:posOffset>
+          </wp:positionH>
+          <wp:positionV relativeFrom="paragraph">
+            <wp:posOffset>441740</wp:posOffset>
+          </wp:positionV>
+          <wp:extent cx="180000" cy="180000"/>
+          <wp:effectExtent l="0" t="0" r="0" b="0"/>
+          <wp:wrapNone/>
+          <wp:docPr id="597503044" name="Bildobjekt 1"/>
+          <wp:cNvGraphicFramePr>
+            <a:graphicFrameLocks xmlns:a="http://schemas.openxmlformats.org/drawingml/2006/main" noChangeAspect="1"/>
+          </wp:cNvGraphicFramePr>
+          <a:graphic xmlns:a="http://schemas.openxmlformats.org/drawingml/2006/main">
+            <a:graphicData uri="http://schemas.openxmlformats.org/drawingml/2006/picture">
+              <pic:pic xmlns:pic="http://schemas.openxmlformats.org/drawingml/2006/picture">
+                <pic:nvPicPr>
+                  <pic:cNvPr id="0" name="Picture 2"/>
+                  <pic:cNvPicPr>
+                    <a:picLocks noChangeAspect="1" noChangeArrowheads="1"/>
+                  </pic:cNvPicPr>
+                </pic:nvPicPr>
+                <pic:blipFill>
+                  <a:blip r:embed="rId1">
+                    <a:extLst>
+                      <a:ext uri="{28A0092B-C50C-407E-A947-70E740481C1C}">
+                        <a14:useLocalDpi xmlns:a14="http://schemas.microsoft.com/office/drawing/2010/main" val="0"/>
+                      </a:ext>
+                    </a:extLst>
+                  </a:blip>
+                  <a:srcRect/>
+                  <a:stretch>
+                    <a:fillRect/>
+                  </a:stretch>
+                </pic:blipFill>
+                <pic:spPr bwMode="auto">
+                  <a:xfrm>
+                    <a:off x="0" y="0"/>
+                    <a:ext cx="180000" cy="180000"/>
+                  </a:xfrm>
+                  <a:prstGeom prst="rect">
+                    <a:avLst/>
+                  </a:prstGeom>
+                  <a:noFill/>
+                </pic:spPr>
+              </pic:pic>
+            </a:graphicData>
+          </a:graphic>
+          <wp14:sizeRelH relativeFrom="margin">
+            <wp14:pctWidth>0</wp14:pctWidth>
+          </wp14:sizeRelH>
+          <wp14:sizeRelV relativeFrom="margin">
+            <wp14:pctHeight>0</wp14:pctHeight>
+          </wp14:sizeRelV>
+        </wp:anchor>
+      </w:drawing>
+    </w:r>
+    <w:r>
+      <w:rPr>
+        <w:vertAlign w:val="superscript"/>
+      </w:rPr>
+      <w:pict w14:anchorId="4E9AA92F">
+        <v:shapetype id="_x0000_t32" coordsize="21600,21600" o:spt="32" o:oned="t" path="m,l21600,21600e" filled="f">
+          <v:path arrowok="t" fillok="f" o:connecttype="none"/>
+          <o:lock v:ext="edit" shapetype="t"/>
+        </v:shapetype>
+        <v:shape id="_x0000_s1027" type="#_x0000_t32" style="position:absolute;margin-left:-.1pt;margin-top:2.9pt;width:221pt;height:0;z-index:251659264;mso-position-horizontal-relative:text;mso-position-vertical-relative:text" o:connectortype="straight"/>
+      </w:pict>
+    </w:r>
+    <w:r>
+      <w:rPr>
+        <w:vertAlign w:val="superscript"/>
+      </w:rPr>
+      <w:t>1</w:t>
+    </w:r>
+    <w:r>
+      <w:t>Lund University, Department of Biology</w:t>
+    </w:r>
+    <w:r>
+      <w:br/>
+    </w:r>
+    <w:hyperlink r:id="rId2" w:history="1">
+      <w:r>
+        <w:rPr>
+          <w:rStyle w:val="Hyperlnk"/>
+        </w:rPr>
+        <w:t>eric.wahlsteen@gmail.com</w:t>
+      </w:r>
+    </w:hyperlink>
+    <w:r>
+      <w:br/>
+    </w:r>
+    <w:hyperlink r:id="rId3" w:history="1">
+      <w:r>
+        <w:t xml:space="preserve">         </w:t>
+      </w:r>
+      <w:r>
+        <w:rPr>
+          <w:rStyle w:val="Hyperlnk"/>
+        </w:rPr>
+        <w:t>0000-0001-8283-1112</w:t>
+      </w:r>
+    </w:hyperlink>
+  </w:p>
+</w:ftr>
+</file>
+
+<file path=word/footnotes.xml><?xml version="1.0" encoding="utf-8"?>
+<w:footnotes xmlns:wpc="http://schemas.microsoft.com/office/word/2010/wordprocessingCanvas" xmlns:cx="http://schemas.microsoft.com/office/drawing/2014/chartex" xmlns:cx1="http://schemas.microsoft.com/office/drawing/2015/9/8/chartex" xmlns:cx2="http://schemas.microsoft.com/office/drawing/2015/10/21/chartex" xmlns:cx3="http://schemas.microsoft.com/office/drawing/2016/5/9/chartex" xmlns:cx4="http://schemas.microsoft.com/office/drawing/2016/5/10/chartex" xmlns:cx5="http://schemas.microsoft.com/office/drawing/2016/5/11/chartex" xmlns:cx6="http://schemas.microsoft.com/office/drawing/2016/5/12/chartex" xmlns:cx7="http://schemas.microsoft.com/office/drawing/2016/5/13/chartex" xmlns:cx8="http://schemas.microsoft.com/office/drawing/2016/5/14/chartex" xmlns:mc="http://schemas.openxmlformats.org/markup-compatibility/2006" xmlns:aink="http://schemas.microsoft.com/office/drawing/2016/ink" xmlns:am3d="http://schemas.microsoft.com/office/drawing/2017/model3d" xmlns:o="urn:schemas-microsoft-com:office:office" xmlns:oel="http://schemas.microsoft.com/office/2019/extlst" xmlns:r="http://schemas.openxmlformats.org/officeDocument/2006/relationships" xmlns:m="http://schemas.openxmlformats.org/officeDocument/2006/math" xmlns:v="urn:schemas-microsoft-com:vml" xmlns:wp14="http://schemas.microsoft.com/office/word/2010/wordprocessingDrawing" xmlns:wp="http://schemas.openxmlformats.org/drawingml/2006/wordprocessingDrawing" xmlns:w10="urn:schemas-microsoft-com:office:word" xmlns:w="http://schemas.openxmlformats.org/wordprocessingml/2006/main" xmlns:w14="http://schemas.microsoft.com/office/word/2010/wordml" xmlns:w15="http://schemas.microsoft.com/office/word/2012/wordml" xmlns:w16cex="http://schemas.microsoft.com/office/word/2018/wordml/cex" xmlns:w16cid="http://schemas.microsoft.com/office/word/2016/wordml/cid" xmlns:w16="http://schemas.microsoft.com/office/word/2018/wordml" xmlns:w16du="http://schemas.microsoft.com/office/word/2023/wordml/word16du" xmlns:w16sdtdh="http://schemas.microsoft.com/office/word/2020/wordml/sdtdatahash" xmlns:w16sdtfl="http://schemas.microsoft.com/office/word/2024/wordml/sdtformatlock" xmlns:w16se="http://schemas.microsoft.com/office/word/2015/wordml/symex" xmlns:wpg="http://schemas.microsoft.com/office/word/2010/wordprocessingGroup" xmlns:wpi="http://schemas.microsoft.com/office/word/2010/wordprocessingInk" xmlns:wne="http://schemas.microsoft.com/office/word/2006/wordml" xmlns:wps="http://schemas.microsoft.com/office/word/2010/wordprocessingShape" mc:Ignorable="w14 w15 w16se w16cid w16 w16cex w16sdtdh w16sdtfl w16du wp14">
+  <w:footnote w:type="separator" w:id="-1">
+    <w:p>
+      <w:pPr>
+        <w:spacing w:after="0"/>
+      </w:pPr>
+      <w:r>
+        <w:separator/>
+      </w:r>
+    </w:p>
+  </w:footnote>
+  <w:footnote w:type="continuationSeparator" w:id="0">
+    <w:p>
+      <w:pPr>
+        <w:spacing w:after="0"/>
+      </w:pPr>
+      <w:r>
+        <w:continuationSeparator/>
+      </w:r>
+    </w:p>
+  </w:footnote>
+</w:footnotes>
 </file>
 
 <file path=word/numbering.xml><?xml version="1.0" encoding="utf-8"?>
@@ -10953,6 +11625,7 @@
     </w:pPrDefault>
   </w:docDefaults>
   <w:latentStyles w:defLockedState="0" w:defUIPriority="0" w:defSemiHidden="0" w:defUnhideWhenUsed="0" w:defQFormat="0" w:count="376">
+    <w:lsdException w:name="footer" w:uiPriority="99"/>
     <w:lsdException w:name="Normal Table" w:semiHidden="1" w:unhideWhenUsed="1"/>
     <w:lsdException w:name="Table Simple 1" w:semiHidden="1" w:unhideWhenUsed="1"/>
     <w:lsdException w:name="Table Simple 2" w:semiHidden="1" w:unhideWhenUsed="1"/>
@@ -11199,6 +11872,9 @@
   <w:style w:type="paragraph" w:default="1" w:styleId="Normal">
     <w:name w:val="Normal"/>
     <w:qFormat/>
+    <w:rPr>
+      <w:lang w:val="en-GB"/>
+    </w:rPr>
   </w:style>
   <w:style w:type="paragraph" w:styleId="Rubrik1">
     <w:name w:val="heading 1"/>
@@ -11207,7 +11883,7 @@
     <w:link w:val="Rubrik1Char"/>
     <w:uiPriority w:val="9"/>
     <w:qFormat/>
-    <w:rsid w:val="00F67FD5"/>
+    <w:rsid w:val="00E16F30"/>
     <w:pPr>
       <w:keepNext/>
       <w:keepLines/>
@@ -11217,7 +11893,7 @@
     </w:pPr>
     <w:rPr>
       <w:rFonts w:asciiTheme="majorHAnsi" w:eastAsiaTheme="majorEastAsia" w:hAnsiTheme="majorHAnsi" w:cstheme="majorBidi"/>
-      <w:sz w:val="40"/>
+      <w:sz w:val="28"/>
       <w:szCs w:val="40"/>
     </w:rPr>
   </w:style>
@@ -11430,9 +12106,10 @@
     <w:name w:val="Body Text"/>
     <w:basedOn w:val="Normal"/>
     <w:qFormat/>
-    <w:rsid w:val="00F67FD5"/>
+    <w:rsid w:val="00E16F30"/>
     <w:pPr>
-      <w:spacing w:before="180" w:after="180" w:line="360" w:lineRule="auto"/>
+      <w:spacing w:before="180" w:after="180"/>
+      <w:jc w:val="both"/>
     </w:pPr>
     <w:rPr>
       <w:sz w:val="22"/>
@@ -11459,7 +12136,7 @@
     <w:link w:val="RubrikChar"/>
     <w:uiPriority w:val="10"/>
     <w:qFormat/>
-    <w:rsid w:val="00A10FD9"/>
+    <w:rsid w:val="00F824D3"/>
     <w:pPr>
       <w:spacing w:after="80"/>
       <w:contextualSpacing/>
@@ -11467,7 +12144,7 @@
     </w:pPr>
     <w:rPr>
       <w:rFonts w:asciiTheme="majorHAnsi" w:eastAsiaTheme="majorEastAsia" w:hAnsiTheme="majorHAnsi" w:cstheme="majorBidi"/>
-      <w:sz w:val="56"/>
+      <w:sz w:val="48"/>
       <w:szCs w:val="56"/>
     </w:rPr>
   </w:style>
@@ -11476,10 +12153,10 @@
     <w:basedOn w:val="Standardstycketeckensnitt"/>
     <w:link w:val="Rubrik"/>
     <w:uiPriority w:val="10"/>
-    <w:rsid w:val="00A10FD9"/>
+    <w:rsid w:val="00F824D3"/>
     <w:rPr>
       <w:rFonts w:asciiTheme="majorHAnsi" w:eastAsiaTheme="majorEastAsia" w:hAnsiTheme="majorHAnsi" w:cstheme="majorBidi"/>
-      <w:sz w:val="56"/>
+      <w:sz w:val="48"/>
       <w:szCs w:val="56"/>
     </w:rPr>
   </w:style>
@@ -11490,7 +12167,7 @@
     <w:link w:val="UnderrubrikChar"/>
     <w:uiPriority w:val="11"/>
     <w:qFormat/>
-    <w:rsid w:val="00A10FD9"/>
+    <w:rsid w:val="00FF68D6"/>
     <w:pPr>
       <w:numPr>
         <w:ilvl w:val="1"/>
@@ -11498,7 +12175,7 @@
     </w:pPr>
     <w:rPr>
       <w:spacing w:val="15"/>
-      <w:sz w:val="28"/>
+      <w:sz w:val="24"/>
       <w:szCs w:val="28"/>
     </w:rPr>
   </w:style>
@@ -11507,12 +12184,10 @@
     <w:basedOn w:val="Standardstycketeckensnitt"/>
     <w:link w:val="Underrubrik"/>
     <w:uiPriority w:val="11"/>
-    <w:rsid w:val="00A10FD9"/>
+    <w:rsid w:val="00FF68D6"/>
     <w:rPr>
-      <w:rFonts w:eastAsiaTheme="majorEastAsia" w:cstheme="majorBidi"/>
-      <w:color w:val="595959" w:themeColor="text1" w:themeTint="A6"/>
+      <w:rFonts w:asciiTheme="majorHAnsi" w:eastAsiaTheme="majorEastAsia" w:hAnsiTheme="majorHAnsi" w:cstheme="majorBidi"/>
       <w:spacing w:val="15"/>
-      <w:sz w:val="28"/>
       <w:szCs w:val="28"/>
     </w:rPr>
   </w:style>
@@ -11586,10 +12261,10 @@
     <w:basedOn w:val="Standardstycketeckensnitt"/>
     <w:link w:val="Rubrik1"/>
     <w:uiPriority w:val="9"/>
-    <w:rsid w:val="00F67FD5"/>
+    <w:rsid w:val="00E16F30"/>
     <w:rPr>
       <w:rFonts w:asciiTheme="majorHAnsi" w:eastAsiaTheme="majorEastAsia" w:hAnsiTheme="majorHAnsi" w:cstheme="majorBidi"/>
-      <w:sz w:val="40"/>
+      <w:sz w:val="28"/>
       <w:szCs w:val="40"/>
     </w:rPr>
   </w:style>
@@ -12158,6 +12833,66 @@
       <w:color w:val="666666"/>
     </w:rPr>
   </w:style>
+  <w:style w:type="character" w:styleId="Olstomnmnande">
+    <w:name w:val="Unresolved Mention"/>
+    <w:basedOn w:val="Standardstycketeckensnitt"/>
+    <w:uiPriority w:val="99"/>
+    <w:semiHidden/>
+    <w:unhideWhenUsed/>
+    <w:rsid w:val="00C50318"/>
+    <w:rPr>
+      <w:color w:val="605E5C"/>
+      <w:shd w:val="clear" w:color="auto" w:fill="E1DFDD"/>
+    </w:rPr>
+  </w:style>
+  <w:style w:type="paragraph" w:styleId="Sidhuvud">
+    <w:name w:val="header"/>
+    <w:basedOn w:val="Normal"/>
+    <w:link w:val="SidhuvudChar"/>
+    <w:rsid w:val="00B04F97"/>
+    <w:pPr>
+      <w:tabs>
+        <w:tab w:val="center" w:pos="4536"/>
+        <w:tab w:val="right" w:pos="9072"/>
+      </w:tabs>
+      <w:spacing w:after="0"/>
+    </w:pPr>
+  </w:style>
+  <w:style w:type="character" w:customStyle="1" w:styleId="SidhuvudChar">
+    <w:name w:val="Sidhuvud Char"/>
+    <w:basedOn w:val="Standardstycketeckensnitt"/>
+    <w:link w:val="Sidhuvud"/>
+    <w:rsid w:val="00B04F97"/>
+  </w:style>
+  <w:style w:type="paragraph" w:styleId="Sidfot">
+    <w:name w:val="footer"/>
+    <w:basedOn w:val="Normal"/>
+    <w:link w:val="SidfotChar"/>
+    <w:uiPriority w:val="99"/>
+    <w:rsid w:val="00B04F97"/>
+    <w:pPr>
+      <w:tabs>
+        <w:tab w:val="center" w:pos="4536"/>
+        <w:tab w:val="right" w:pos="9072"/>
+      </w:tabs>
+      <w:spacing w:after="0"/>
+    </w:pPr>
+  </w:style>
+  <w:style w:type="character" w:customStyle="1" w:styleId="SidfotChar">
+    <w:name w:val="Sidfot Char"/>
+    <w:basedOn w:val="Standardstycketeckensnitt"/>
+    <w:link w:val="Sidfot"/>
+    <w:uiPriority w:val="99"/>
+    <w:rsid w:val="00B04F97"/>
+  </w:style>
+  <w:style w:type="paragraph" w:styleId="Normalwebb">
+    <w:name w:val="Normal (Web)"/>
+    <w:basedOn w:val="Normal"/>
+    <w:rsid w:val="009A0E94"/>
+    <w:rPr>
+      <w:rFonts w:ascii="Times New Roman" w:hAnsi="Times New Roman" w:cs="Times New Roman"/>
+    </w:rPr>
+  </w:style>
 </w:styles>
 </file>
 
@@ -12454,4 +13189,16 @@
     </a:ext>
   </a:extLst>
 </a:theme>
+</file>
+
+<file path=customXml/item1.xml><?xml version="1.0" encoding="utf-8"?>
+<b:Sources xmlns:b="http://schemas.openxmlformats.org/officeDocument/2006/bibliography" xmlns="http://schemas.openxmlformats.org/officeDocument/2006/bibliography" SelectedStyle="\APASixthEditionOfficeOnline.xsl" StyleName="APA" Version="6"/>
+</file>
+
+<file path=customXml/itemProps1.xml><?xml version="1.0" encoding="utf-8"?>
+<ds:datastoreItem xmlns:ds="http://schemas.openxmlformats.org/officeDocument/2006/customXml" ds:itemID="{B4523DF7-36DE-485B-9BCB-DA2AA4307A12}">
+  <ds:schemaRefs>
+    <ds:schemaRef ds:uri="http://schemas.openxmlformats.org/officeDocument/2006/bibliography"/>
+  </ds:schemaRefs>
+</ds:datastoreItem>
 </file>
</xml_diff>